<commit_message>
eCRF 19 en 30: patiëntvriendelijke handleiding MoveMonitor en informatiefolder Orthotimer-sensor ingevuld (waren nog leeg)
</commit_message>
<xml_diff>
--- a/(e)CRF/Per nummer/19_Gebruikershandleiding MoveMonitor.docx
+++ b/(e)CRF/Per nummer/19_Gebruikershandleiding MoveMonitor.docx
@@ -1,6 +1,6 @@
 
 <file path=word/document.xml><?xml version="1.0" encoding="utf-8"?>
-<w:document xmlns:wpc="http://schemas.microsoft.com/office/word/2010/wordprocessingCanvas" xmlns:cx="http://schemas.microsoft.com/office/drawing/2014/chartex" xmlns:cx1="http://schemas.microsoft.com/office/drawing/2015/9/8/chartex" xmlns:cx2="http://schemas.microsoft.com/office/drawing/2015/10/21/chartex" xmlns:cx3="http://schemas.microsoft.com/office/drawing/2016/5/9/chartex" xmlns:cx4="http://schemas.microsoft.com/office/drawing/2016/5/10/chartex" xmlns:cx5="http://schemas.microsoft.com/office/drawing/2016/5/11/chartex" xmlns:cx6="http://schemas.microsoft.com/office/drawing/2016/5/12/chartex" xmlns:cx7="http://schemas.microsoft.com/office/drawing/2016/5/13/chartex" xmlns:cx8="http://schemas.microsoft.com/office/drawing/2016/5/14/chartex" xmlns:mc="http://schemas.openxmlformats.org/markup-compatibility/2006" xmlns:aink="http://schemas.microsoft.com/office/drawing/2016/ink" xmlns:am3d="http://schemas.microsoft.com/office/drawing/2017/model3d" xmlns:o="urn:schemas-microsoft-com:office:office" xmlns:oel="http://schemas.microsoft.com/office/2019/extlst" xmlns:r="http://schemas.openxmlformats.org/officeDocument/2006/relationships" xmlns:m="http://schemas.openxmlformats.org/officeDocument/2006/math" xmlns:v="urn:schemas-microsoft-com:vml" xmlns:wp14="http://schemas.microsoft.com/office/word/2010/wordprocessingDrawing" xmlns:wp="http://schemas.openxmlformats.org/drawingml/2006/wordprocessingDrawing" xmlns:w10="urn:schemas-microsoft-com:office:word" xmlns:w="http://schemas.openxmlformats.org/wordprocessingml/2006/main" xmlns:w14="http://schemas.microsoft.com/office/word/2010/wordml" xmlns:w15="http://schemas.microsoft.com/office/word/2012/wordml" xmlns:w16cex="http://schemas.microsoft.com/office/word/2018/wordml/cex" xmlns:w16cid="http://schemas.microsoft.com/office/word/2016/wordml/cid" xmlns:w16="http://schemas.microsoft.com/office/word/2018/wordml" xmlns:w16du="http://schemas.microsoft.com/office/word/2023/wordml/word16du" xmlns:w16sdtdh="http://schemas.microsoft.com/office/word/2020/wordml/sdtdatahash" xmlns:w16sdtfl="http://schemas.microsoft.com/office/word/2024/wordml/sdtformatlock" xmlns:w16se="http://schemas.microsoft.com/office/word/2015/wordml/symex" xmlns:wpg="http://schemas.microsoft.com/office/word/2010/wordprocessingGroup" xmlns:wpi="http://schemas.microsoft.com/office/word/2010/wordprocessingInk" xmlns:wne="http://schemas.microsoft.com/office/word/2006/wordml" xmlns:wps="http://schemas.microsoft.com/office/word/2010/wordprocessingShape" mc:Ignorable="w14 w15 w16se w16cid w16 w16cex w16sdtdh w16sdtfl w16du wp14">
+<w:document xmlns:wpc="http://schemas.microsoft.com/office/word/2010/wordprocessingCanvas" xmlns:cx="http://schemas.microsoft.com/office/drawing/2014/chartex" xmlns:cx1="http://schemas.microsoft.com/office/drawing/2015/9/8/chartex" xmlns:cx2="http://schemas.microsoft.com/office/drawing/2015/10/21/chartex" xmlns:cx3="http://schemas.microsoft.com/office/drawing/2016/5/9/chartex" xmlns:cx4="http://schemas.microsoft.com/office/drawing/2016/5/10/chartex" xmlns:cx5="http://schemas.microsoft.com/office/drawing/2016/5/11/chartex" xmlns:cx6="http://schemas.microsoft.com/office/drawing/2016/5/12/chartex" xmlns:cx7="http://schemas.microsoft.com/office/drawing/2016/5/13/chartex" xmlns:cx8="http://schemas.microsoft.com/office/drawing/2016/5/14/chartex" xmlns:mc="http://schemas.openxmlformats.org/markup-compatibility/2006" xmlns:aink="http://schemas.microsoft.com/office/drawing/2016/ink" xmlns:am3d="http://schemas.microsoft.com/office/drawing/2017/model3d" xmlns:o="urn:schemas-microsoft-com:office:office" xmlns:oel="http://schemas.microsoft.com/office/2019/extlst" xmlns:r="http://schemas.openxmlformats.org/officeDocument/2006/relationships" xmlns:m="http://schemas.openxmlformats.org/officeDocument/2006/math" xmlns:v="urn:schemas-microsoft-com:vml" xmlns:wp14="http://schemas.microsoft.com/office/word/2010/wordprocessingDrawing" xmlns:wp="http://schemas.openxmlformats.org/drawingml/2006/wordprocessingDrawing" xmlns:w10="urn:schemas-microsoft-com:office:word" xmlns:w="http://schemas.openxmlformats.org/wordprocessingml/2006/main" xmlns:w14="http://schemas.microsoft.com/office/word/2010/wordml" xmlns:w15="http://schemas.microsoft.com/office/word/2012/wordml" xmlns:w16cei="http://schemas.microsoft.com/office/word/2026/wordml/cei" xmlns:w16cex="http://schemas.microsoft.com/office/word/2018/wordml/cex" xmlns:w16cid="http://schemas.microsoft.com/office/word/2016/wordml/cid" xmlns:w16="http://schemas.microsoft.com/office/word/2018/wordml" xmlns:w16du="http://schemas.microsoft.com/office/word/2023/wordml/word16du" xmlns:w16sdtdh="http://schemas.microsoft.com/office/word/2020/wordml/sdtdatahash" xmlns:w16sdtfl="http://schemas.microsoft.com/office/word/2024/wordml/sdtformatlock" xmlns:w16se="http://schemas.microsoft.com/office/word/2015/wordml/symex" xmlns:wpg="http://schemas.microsoft.com/office/word/2010/wordprocessingGroup" xmlns:wpi="http://schemas.microsoft.com/office/word/2010/wordprocessingInk" xmlns:wne="http://schemas.microsoft.com/office/word/2006/wordml" xmlns:wps="http://schemas.microsoft.com/office/word/2010/wordprocessingShape" mc:Ignorable="w14 w15 w16se w16cid w16 w16cex w16sdtdh w16sdtfl w16du wp14">
   <w:body>
     <w:p>
       <w:pPr>
@@ -13,9 +13,8 @@
       </w:pPr>
       <w:r>
         <w:rPr>
-          <w:rFonts w:ascii="Arial" w:hAnsi="Arial" w:cs="Arial" w:eastAsia="Arial"/>
-          <w:b w:val="1"/>
-          <w:bCs w:val="1"/>
+          <w:b/>
+          <w:bCs/>
           <w:color w:val="123A5F"/>
           <w:sz w:val="28"/>
           <w:szCs w:val="28"/>
@@ -25,9 +24,8 @@
       </w:r>
       <w:r>
         <w:rPr>
-          <w:rFonts w:ascii="Arial" w:hAnsi="Arial" w:cs="Arial" w:eastAsia="Arial"/>
-          <w:b w:val="1"/>
-          <w:bCs w:val="1"/>
+          <w:b/>
+          <w:bCs/>
           <w:color w:val="123A5F"/>
           <w:sz w:val="28"/>
           <w:szCs w:val="28"/>
@@ -37,9 +35,8 @@
       </w:r>
       <w:r>
         <w:rPr>
-          <w:rFonts w:ascii="Arial" w:hAnsi="Arial" w:cs="Arial" w:eastAsia="Arial"/>
-          <w:b w:val="1"/>
-          <w:bCs w:val="1"/>
+          <w:b/>
+          <w:bCs/>
           <w:color w:val="123A5F"/>
           <w:sz w:val="28"/>
           <w:szCs w:val="28"/>
@@ -49,9 +46,8 @@
       </w:r>
       <w:r>
         <w:rPr>
-          <w:rFonts w:ascii="Arial" w:hAnsi="Arial" w:cs="Arial" w:eastAsia="Arial"/>
-          <w:b w:val="1"/>
-          <w:bCs w:val="1"/>
+          <w:b/>
+          <w:bCs/>
           <w:color w:val="123A5F"/>
           <w:sz w:val="28"/>
           <w:szCs w:val="28"/>
@@ -61,49 +57,145 @@
       </w:r>
       <w:r>
         <w:rPr>
-          <w:rFonts w:ascii="Arial" w:hAnsi="Arial" w:cs="Arial" w:eastAsia="Arial"/>
-          <w:b w:val="1"/>
-          <w:bCs w:val="1"/>
+          <w:b/>
+          <w:bCs/>
           <w:color w:val="123A5F"/>
           <w:sz w:val="28"/>
           <w:szCs w:val="28"/>
           <w:lang w:val="en-US"/>
         </w:rPr>
-        <w:t xml:space="preserve"> </w:t>
+        <w:t xml:space="preserve"> Participant User Manual of the MoveMonitor</w:t>
       </w:r>
+    </w:p>
+    <w:p>
       <w:r>
         <w:rPr>
-          <w:rFonts w:ascii="Arial" w:hAnsi="Arial" w:cs="Arial" w:eastAsia="Arial"/>
-          <w:b w:val="1"/>
-          <w:bCs w:val="1"/>
-          <w:color w:val="123A5F"/>
-          <w:sz w:val="28"/>
-          <w:szCs w:val="28"/>
-          <w:lang w:val="en-US"/>
+          <w:color w:val="2E3B47"/>
         </w:rPr>
-        <w:t xml:space="preserve">Participant User Manual of the </w:t>
+        <w:t>De bewegingsmeter (MoveMonitor) is een klein toestel dat meet hoe actief u bent gedurende de dag. Dit geeft een beeld van uw normale beweegpatroon.</w:t>
       </w:r>
+    </w:p>
+    <w:p>
       <w:r>
         <w:rPr>
-          <w:rFonts w:ascii="Arial" w:hAnsi="Arial" w:cs="Arial" w:eastAsia="Arial"/>
-          <w:b w:val="1"/>
-          <w:bCs w:val="1"/>
+          <w:b/>
           <w:color w:val="123A5F"/>
-          <w:sz w:val="28"/>
-          <w:szCs w:val="28"/>
-          <w:lang w:val="en-US"/>
+          <w:sz w:val="27"/>
         </w:rPr>
-        <w:t>MoveMonitor</w:t>
+        <w:t>Hoe draagt u het toestel?</w:t>
       </w:r>
     </w:p>
+    <w:p>
+      <w:pPr>
+        <w:pStyle w:val="Lijstalinea"/>
+        <w:ind w:left="360"/>
+      </w:pPr>
+      <w:r>
+        <w:rPr>
+          <w:color w:val="2E3B47"/>
+        </w:rPr>
+        <w:t>•  U draagt het toestel rond uw middel, ter hoogte van uw onderrug — op de huid of over een dunne laag kleding.</w:t>
+      </w:r>
+    </w:p>
+    <w:p>
+      <w:pPr>
+        <w:pStyle w:val="Lijstalinea"/>
+        <w:ind w:left="360"/>
+      </w:pPr>
+      <w:r>
+        <w:rPr>
+          <w:color w:val="2E3B47"/>
+        </w:rPr>
+        <w:t>•  Het toestel is niet waterdicht: doe het af wanneer u gaat douchen, baden of zwemmen, en doe het nadien opnieuw om.</w:t>
+      </w:r>
+    </w:p>
+    <w:p>
+      <w:pPr>
+        <w:pStyle w:val="Lijstalinea"/>
+        <w:ind w:left="360"/>
+      </w:pPr>
+      <w:r>
+        <w:rPr>
+          <w:color w:val="2E3B47"/>
+        </w:rPr>
+        <w:t>•  U draagt het toestel 7 dagen na elkaar, dag en nacht.</w:t>
+      </w:r>
+    </w:p>
+    <w:p>
+      <w:pPr>
+        <w:pStyle w:val="Lijstalinea"/>
+        <w:ind w:left="360"/>
+      </w:pPr>
+      <w:r>
+        <w:rPr>
+          <w:color w:val="2E3B47"/>
+        </w:rPr>
+        <w:t>•  U gaat gewoon verder met uw dagelijkse activiteiten — er is niets speciaals dat u moet doen.</w:t>
+      </w:r>
+    </w:p>
+    <w:p>
+      <w:r>
+        <w:rPr>
+          <w:b/>
+          <w:color w:val="123A5F"/>
+          <w:sz w:val="27"/>
+        </w:rPr>
+        <w:t>Wanneer draagt u de bewegingsmeter?</w:t>
+      </w:r>
+    </w:p>
+    <w:p>
+      <w:r>
+        <w:rPr>
+          <w:color w:val="2E3B47"/>
+        </w:rPr>
+        <w:t>U draagt de bewegingsmeter twee keer tijdens de studie: bij de start, en opnieuw na 6 maanden. Telkens gedurende één week.</w:t>
+      </w:r>
+    </w:p>
+    <w:p>
+      <w:r>
+        <w:rPr>
+          <w:b/>
+          <w:color w:val="123A5F"/>
+          <w:sz w:val="27"/>
+        </w:rPr>
+        <w:t>Wat gebeurt er met het toestel nadien?</w:t>
+      </w:r>
+    </w:p>
+    <w:p>
+      <w:r>
+        <w:rPr>
+          <w:color w:val="2E3B47"/>
+        </w:rPr>
+        <w:t>Na de 7 dagen brengt u het toestel terug mee naar uw volgende afspraak. Uw zorgverlener leest de gegevens dan uit.</w:t>
+      </w:r>
+    </w:p>
+    <w:p>
+      <w:r>
+        <w:rPr>
+          <w:b/>
+          <w:color w:val="123A5F"/>
+          <w:sz w:val="27"/>
+        </w:rPr>
+        <w:t>Vragen?</w:t>
+      </w:r>
+    </w:p>
+    <w:p>
+      <w:r>
+        <w:rPr>
+          <w:color w:val="2E3B47"/>
+        </w:rPr>
+        <w:t>Hebt u vragen over de bewegingsmeter? Neem dan contact op met uw zorgverlener.</w:t>
+      </w:r>
+    </w:p>
+    <w:p/>
     <w:sectPr>
-      <w:headerReference w:type="even" r:id="rId7"/>
-      <w:headerReference w:type="default" r:id="rId8"/>
-      <w:footerReference w:type="even" r:id="rId9"/>
-      <w:footerReference w:type="default" r:id="rId10"/>
-      <w:headerReference w:type="first" r:id="rId11"/>
-      <w:footerReference w:type="first" r:id="rId12"/>
-      <w:pgSz w:w="11906" w:h="16838" w:orient="portrait"/>
+      <w:headerReference w:type="even" r:id="rId10"/>
+      <w:headerReference w:type="default" r:id="rId11"/>
+      <w:footerReference w:type="even" r:id="rId12"/>
+      <w:footerReference w:type="default" r:id="rId13"/>
+      <w:headerReference w:type="first" r:id="rId14"/>
+      <w:footerReference w:type="first" r:id="rId15"/>
+      <w:pgSz w:w="11906" w:h="16838"/>
       <w:pgMar w:top="1440" w:right="1440" w:bottom="1440" w:left="1440" w:header="708" w:footer="708" w:gutter="0"/>
       <w:cols w:space="708"/>
       <w:docGrid w:linePitch="360"/>
@@ -113,7 +205,7 @@
 </file>
 
 <file path=word/endnotes.xml><?xml version="1.0" encoding="utf-8"?>
-<w:endnotes xmlns:wpc="http://schemas.microsoft.com/office/word/2010/wordprocessingCanvas" xmlns:cx="http://schemas.microsoft.com/office/drawing/2014/chartex" xmlns:cx1="http://schemas.microsoft.com/office/drawing/2015/9/8/chartex" xmlns:cx2="http://schemas.microsoft.com/office/drawing/2015/10/21/chartex" xmlns:cx3="http://schemas.microsoft.com/office/drawing/2016/5/9/chartex" xmlns:cx4="http://schemas.microsoft.com/office/drawing/2016/5/10/chartex" xmlns:cx5="http://schemas.microsoft.com/office/drawing/2016/5/11/chartex" xmlns:cx6="http://schemas.microsoft.com/office/drawing/2016/5/12/chartex" xmlns:cx7="http://schemas.microsoft.com/office/drawing/2016/5/13/chartex" xmlns:cx8="http://schemas.microsoft.com/office/drawing/2016/5/14/chartex" xmlns:mc="http://schemas.openxmlformats.org/markup-compatibility/2006" xmlns:aink="http://schemas.microsoft.com/office/drawing/2016/ink" xmlns:am3d="http://schemas.microsoft.com/office/drawing/2017/model3d" xmlns:o="urn:schemas-microsoft-com:office:office" xmlns:oel="http://schemas.microsoft.com/office/2019/extlst" xmlns:r="http://schemas.openxmlformats.org/officeDocument/2006/relationships" xmlns:m="http://schemas.openxmlformats.org/officeDocument/2006/math" xmlns:v="urn:schemas-microsoft-com:vml" xmlns:wp14="http://schemas.microsoft.com/office/word/2010/wordprocessingDrawing" xmlns:wp="http://schemas.openxmlformats.org/drawingml/2006/wordprocessingDrawing" xmlns:w10="urn:schemas-microsoft-com:office:word" xmlns:w="http://schemas.openxmlformats.org/wordprocessingml/2006/main" xmlns:w14="http://schemas.microsoft.com/office/word/2010/wordml" xmlns:w15="http://schemas.microsoft.com/office/word/2012/wordml" xmlns:w16cex="http://schemas.microsoft.com/office/word/2018/wordml/cex" xmlns:w16cid="http://schemas.microsoft.com/office/word/2016/wordml/cid" xmlns:w16="http://schemas.microsoft.com/office/word/2018/wordml" xmlns:w16du="http://schemas.microsoft.com/office/word/2023/wordml/word16du" xmlns:w16sdtdh="http://schemas.microsoft.com/office/word/2020/wordml/sdtdatahash" xmlns:w16sdtfl="http://schemas.microsoft.com/office/word/2024/wordml/sdtformatlock" xmlns:w16se="http://schemas.microsoft.com/office/word/2015/wordml/symex" xmlns:wpg="http://schemas.microsoft.com/office/word/2010/wordprocessingGroup" xmlns:wpi="http://schemas.microsoft.com/office/word/2010/wordprocessingInk" xmlns:wne="http://schemas.microsoft.com/office/word/2006/wordml" xmlns:wps="http://schemas.microsoft.com/office/word/2010/wordprocessingShape" mc:Ignorable="w14 w15 w16se w16cid w16 w16cex w16sdtdh w16sdtfl w16du wp14">
+<w:endnotes xmlns:wpc="http://schemas.microsoft.com/office/word/2010/wordprocessingCanvas" xmlns:cx="http://schemas.microsoft.com/office/drawing/2014/chartex" xmlns:cx1="http://schemas.microsoft.com/office/drawing/2015/9/8/chartex" xmlns:cx2="http://schemas.microsoft.com/office/drawing/2015/10/21/chartex" xmlns:cx3="http://schemas.microsoft.com/office/drawing/2016/5/9/chartex" xmlns:cx4="http://schemas.microsoft.com/office/drawing/2016/5/10/chartex" xmlns:cx5="http://schemas.microsoft.com/office/drawing/2016/5/11/chartex" xmlns:cx6="http://schemas.microsoft.com/office/drawing/2016/5/12/chartex" xmlns:cx7="http://schemas.microsoft.com/office/drawing/2016/5/13/chartex" xmlns:cx8="http://schemas.microsoft.com/office/drawing/2016/5/14/chartex" xmlns:mc="http://schemas.openxmlformats.org/markup-compatibility/2006" xmlns:aink="http://schemas.microsoft.com/office/drawing/2016/ink" xmlns:am3d="http://schemas.microsoft.com/office/drawing/2017/model3d" xmlns:o="urn:schemas-microsoft-com:office:office" xmlns:oel="http://schemas.microsoft.com/office/2019/extlst" xmlns:r="http://schemas.openxmlformats.org/officeDocument/2006/relationships" xmlns:m="http://schemas.openxmlformats.org/officeDocument/2006/math" xmlns:v="urn:schemas-microsoft-com:vml" xmlns:wp14="http://schemas.microsoft.com/office/word/2010/wordprocessingDrawing" xmlns:wp="http://schemas.openxmlformats.org/drawingml/2006/wordprocessingDrawing" xmlns:w10="urn:schemas-microsoft-com:office:word" xmlns:w="http://schemas.openxmlformats.org/wordprocessingml/2006/main" xmlns:w14="http://schemas.microsoft.com/office/word/2010/wordml" xmlns:w15="http://schemas.microsoft.com/office/word/2012/wordml" xmlns:w16cei="http://schemas.microsoft.com/office/word/2026/wordml/cei" xmlns:w16cex="http://schemas.microsoft.com/office/word/2018/wordml/cex" xmlns:w16cid="http://schemas.microsoft.com/office/word/2016/wordml/cid" xmlns:w16="http://schemas.microsoft.com/office/word/2018/wordml" xmlns:w16du="http://schemas.microsoft.com/office/word/2023/wordml/word16du" xmlns:w16sdtdh="http://schemas.microsoft.com/office/word/2020/wordml/sdtdatahash" xmlns:w16sdtfl="http://schemas.microsoft.com/office/word/2024/wordml/sdtformatlock" xmlns:w16se="http://schemas.microsoft.com/office/word/2015/wordml/symex" xmlns:wpg="http://schemas.microsoft.com/office/word/2010/wordprocessingGroup" xmlns:wpi="http://schemas.microsoft.com/office/word/2010/wordprocessingInk" xmlns:wne="http://schemas.microsoft.com/office/word/2006/wordml" xmlns:wps="http://schemas.microsoft.com/office/word/2010/wordprocessingShape" mc:Ignorable="w14 w15 w16se w16cid w16 w16cex w16sdtdh w16sdtfl w16du wp14">
   <w:endnote w:type="separator" w:id="-1">
     <w:p>
       <w:pPr>
@@ -132,17 +224,17 @@
 </file>
 
 <file path=word/footer1.xml><?xml version="1.0" encoding="utf-8"?>
-<w:ftr xmlns:wpc="http://schemas.microsoft.com/office/word/2010/wordprocessingCanvas" xmlns:cx="http://schemas.microsoft.com/office/drawing/2014/chartex" xmlns:cx1="http://schemas.microsoft.com/office/drawing/2015/9/8/chartex" xmlns:cx2="http://schemas.microsoft.com/office/drawing/2015/10/21/chartex" xmlns:cx3="http://schemas.microsoft.com/office/drawing/2016/5/9/chartex" xmlns:cx4="http://schemas.microsoft.com/office/drawing/2016/5/10/chartex" xmlns:cx5="http://schemas.microsoft.com/office/drawing/2016/5/11/chartex" xmlns:cx6="http://schemas.microsoft.com/office/drawing/2016/5/12/chartex" xmlns:cx7="http://schemas.microsoft.com/office/drawing/2016/5/13/chartex" xmlns:cx8="http://schemas.microsoft.com/office/drawing/2016/5/14/chartex" xmlns:mc="http://schemas.openxmlformats.org/markup-compatibility/2006" xmlns:aink="http://schemas.microsoft.com/office/drawing/2016/ink" xmlns:am3d="http://schemas.microsoft.com/office/drawing/2017/model3d" xmlns:o="urn:schemas-microsoft-com:office:office" xmlns:oel="http://schemas.microsoft.com/office/2019/extlst" xmlns:r="http://schemas.openxmlformats.org/officeDocument/2006/relationships" xmlns:m="http://schemas.openxmlformats.org/officeDocument/2006/math" xmlns:v="urn:schemas-microsoft-com:vml" xmlns:wp14="http://schemas.microsoft.com/office/word/2010/wordprocessingDrawing" xmlns:wp="http://schemas.openxmlformats.org/drawingml/2006/wordprocessingDrawing" xmlns:w10="urn:schemas-microsoft-com:office:word" xmlns:w="http://schemas.openxmlformats.org/wordprocessingml/2006/main" xmlns:w14="http://schemas.microsoft.com/office/word/2010/wordml" xmlns:w15="http://schemas.microsoft.com/office/word/2012/wordml" xmlns:w16cex="http://schemas.microsoft.com/office/word/2018/wordml/cex" xmlns:w16cid="http://schemas.microsoft.com/office/word/2016/wordml/cid" xmlns:w16="http://schemas.microsoft.com/office/word/2018/wordml" xmlns:w16du="http://schemas.microsoft.com/office/word/2023/wordml/word16du" xmlns:w16sdtdh="http://schemas.microsoft.com/office/word/2020/wordml/sdtdatahash" xmlns:w16sdtfl="http://schemas.microsoft.com/office/word/2024/wordml/sdtformatlock" xmlns:w16se="http://schemas.microsoft.com/office/word/2015/wordml/symex" xmlns:wpg="http://schemas.microsoft.com/office/word/2010/wordprocessingGroup" xmlns:wpi="http://schemas.microsoft.com/office/word/2010/wordprocessingInk" xmlns:wne="http://schemas.microsoft.com/office/word/2006/wordml" xmlns:wps="http://schemas.microsoft.com/office/word/2010/wordprocessingShape" mc:Ignorable="w14 w15 w16se w16cid w16 w16cex w16sdtdh w16sdtfl w16du wp14">
+<w:ftr xmlns:wpc="http://schemas.microsoft.com/office/word/2010/wordprocessingCanvas" xmlns:cx="http://schemas.microsoft.com/office/drawing/2014/chartex" xmlns:cx1="http://schemas.microsoft.com/office/drawing/2015/9/8/chartex" xmlns:cx2="http://schemas.microsoft.com/office/drawing/2015/10/21/chartex" xmlns:cx3="http://schemas.microsoft.com/office/drawing/2016/5/9/chartex" xmlns:cx4="http://schemas.microsoft.com/office/drawing/2016/5/10/chartex" xmlns:cx5="http://schemas.microsoft.com/office/drawing/2016/5/11/chartex" xmlns:cx6="http://schemas.microsoft.com/office/drawing/2016/5/12/chartex" xmlns:cx7="http://schemas.microsoft.com/office/drawing/2016/5/13/chartex" xmlns:cx8="http://schemas.microsoft.com/office/drawing/2016/5/14/chartex" xmlns:mc="http://schemas.openxmlformats.org/markup-compatibility/2006" xmlns:aink="http://schemas.microsoft.com/office/drawing/2016/ink" xmlns:am3d="http://schemas.microsoft.com/office/drawing/2017/model3d" xmlns:o="urn:schemas-microsoft-com:office:office" xmlns:oel="http://schemas.microsoft.com/office/2019/extlst" xmlns:r="http://schemas.openxmlformats.org/officeDocument/2006/relationships" xmlns:m="http://schemas.openxmlformats.org/officeDocument/2006/math" xmlns:v="urn:schemas-microsoft-com:vml" xmlns:wp14="http://schemas.microsoft.com/office/word/2010/wordprocessingDrawing" xmlns:wp="http://schemas.openxmlformats.org/drawingml/2006/wordprocessingDrawing" xmlns:w10="urn:schemas-microsoft-com:office:word" xmlns:w="http://schemas.openxmlformats.org/wordprocessingml/2006/main" xmlns:w14="http://schemas.microsoft.com/office/word/2010/wordml" xmlns:w15="http://schemas.microsoft.com/office/word/2012/wordml" xmlns:w16cei="http://schemas.microsoft.com/office/word/2026/wordml/cei" xmlns:w16cex="http://schemas.microsoft.com/office/word/2018/wordml/cex" xmlns:w16cid="http://schemas.microsoft.com/office/word/2016/wordml/cid" xmlns:w16="http://schemas.microsoft.com/office/word/2018/wordml" xmlns:w16du="http://schemas.microsoft.com/office/word/2023/wordml/word16du" xmlns:w16sdtdh="http://schemas.microsoft.com/office/word/2020/wordml/sdtdatahash" xmlns:w16sdtfl="http://schemas.microsoft.com/office/word/2024/wordml/sdtformatlock" xmlns:w16se="http://schemas.microsoft.com/office/word/2015/wordml/symex" xmlns:wpg="http://schemas.microsoft.com/office/word/2010/wordprocessingGroup" xmlns:wpi="http://schemas.microsoft.com/office/word/2010/wordprocessingInk" xmlns:wne="http://schemas.microsoft.com/office/word/2006/wordml" xmlns:wps="http://schemas.microsoft.com/office/word/2010/wordprocessingShape" mc:Ignorable="w14 w15 w16se w16cid w16 w16cex w16sdtdh w16sdtfl w16du wp14">
   <w:p>
     <w:pPr>
-      <w:pStyle w:val="Footer"/>
+      <w:pStyle w:val="Voettekst"/>
     </w:pPr>
   </w:p>
 </w:ftr>
 </file>
 
 <file path=word/footer2.xml><?xml version="1.0" encoding="utf-8"?>
-<w:ftr xmlns:wpc="http://schemas.microsoft.com/office/word/2010/wordprocessingCanvas" xmlns:cx="http://schemas.microsoft.com/office/drawing/2014/chartex" xmlns:cx1="http://schemas.microsoft.com/office/drawing/2015/9/8/chartex" xmlns:cx2="http://schemas.microsoft.com/office/drawing/2015/10/21/chartex" xmlns:cx3="http://schemas.microsoft.com/office/drawing/2016/5/9/chartex" xmlns:cx4="http://schemas.microsoft.com/office/drawing/2016/5/10/chartex" xmlns:cx5="http://schemas.microsoft.com/office/drawing/2016/5/11/chartex" xmlns:cx6="http://schemas.microsoft.com/office/drawing/2016/5/12/chartex" xmlns:cx7="http://schemas.microsoft.com/office/drawing/2016/5/13/chartex" xmlns:cx8="http://schemas.microsoft.com/office/drawing/2016/5/14/chartex" xmlns:mc="http://schemas.openxmlformats.org/markup-compatibility/2006" xmlns:aink="http://schemas.microsoft.com/office/drawing/2016/ink" xmlns:am3d="http://schemas.microsoft.com/office/drawing/2017/model3d" xmlns:o="urn:schemas-microsoft-com:office:office" xmlns:oel="http://schemas.microsoft.com/office/2019/extlst" xmlns:r="http://schemas.openxmlformats.org/officeDocument/2006/relationships" xmlns:m="http://schemas.openxmlformats.org/officeDocument/2006/math" xmlns:v="urn:schemas-microsoft-com:vml" xmlns:wp14="http://schemas.microsoft.com/office/word/2010/wordprocessingDrawing" xmlns:wp="http://schemas.openxmlformats.org/drawingml/2006/wordprocessingDrawing" xmlns:w10="urn:schemas-microsoft-com:office:word" xmlns:w="http://schemas.openxmlformats.org/wordprocessingml/2006/main" xmlns:w14="http://schemas.microsoft.com/office/word/2010/wordml" xmlns:w15="http://schemas.microsoft.com/office/word/2012/wordml" xmlns:w16cex="http://schemas.microsoft.com/office/word/2018/wordml/cex" xmlns:w16cid="http://schemas.microsoft.com/office/word/2016/wordml/cid" xmlns:w16="http://schemas.microsoft.com/office/word/2018/wordml" xmlns:w16du="http://schemas.microsoft.com/office/word/2023/wordml/word16du" xmlns:w16sdtdh="http://schemas.microsoft.com/office/word/2020/wordml/sdtdatahash" xmlns:w16sdtfl="http://schemas.microsoft.com/office/word/2024/wordml/sdtformatlock" xmlns:w16se="http://schemas.microsoft.com/office/word/2015/wordml/symex" xmlns:wpg="http://schemas.microsoft.com/office/word/2010/wordprocessingGroup" xmlns:wpi="http://schemas.microsoft.com/office/word/2010/wordprocessingInk" xmlns:wne="http://schemas.microsoft.com/office/word/2006/wordml" xmlns:wps="http://schemas.microsoft.com/office/word/2010/wordprocessingShape" mc:Ignorable="w14 w15 w16se w16cid w16 w16cex w16sdtdh w16sdtfl w16du wp14">
+<w:ftr xmlns:wpc="http://schemas.microsoft.com/office/word/2010/wordprocessingCanvas" xmlns:cx="http://schemas.microsoft.com/office/drawing/2014/chartex" xmlns:cx1="http://schemas.microsoft.com/office/drawing/2015/9/8/chartex" xmlns:cx2="http://schemas.microsoft.com/office/drawing/2015/10/21/chartex" xmlns:cx3="http://schemas.microsoft.com/office/drawing/2016/5/9/chartex" xmlns:cx4="http://schemas.microsoft.com/office/drawing/2016/5/10/chartex" xmlns:cx5="http://schemas.microsoft.com/office/drawing/2016/5/11/chartex" xmlns:cx6="http://schemas.microsoft.com/office/drawing/2016/5/12/chartex" xmlns:cx7="http://schemas.microsoft.com/office/drawing/2016/5/13/chartex" xmlns:cx8="http://schemas.microsoft.com/office/drawing/2016/5/14/chartex" xmlns:mc="http://schemas.openxmlformats.org/markup-compatibility/2006" xmlns:aink="http://schemas.microsoft.com/office/drawing/2016/ink" xmlns:am3d="http://schemas.microsoft.com/office/drawing/2017/model3d" xmlns:o="urn:schemas-microsoft-com:office:office" xmlns:oel="http://schemas.microsoft.com/office/2019/extlst" xmlns:r="http://schemas.openxmlformats.org/officeDocument/2006/relationships" xmlns:m="http://schemas.openxmlformats.org/officeDocument/2006/math" xmlns:v="urn:schemas-microsoft-com:vml" xmlns:wp14="http://schemas.microsoft.com/office/word/2010/wordprocessingDrawing" xmlns:wp="http://schemas.openxmlformats.org/drawingml/2006/wordprocessingDrawing" xmlns:w10="urn:schemas-microsoft-com:office:word" xmlns:w="http://schemas.openxmlformats.org/wordprocessingml/2006/main" xmlns:w14="http://schemas.microsoft.com/office/word/2010/wordml" xmlns:w15="http://schemas.microsoft.com/office/word/2012/wordml" xmlns:w16cei="http://schemas.microsoft.com/office/word/2026/wordml/cei" xmlns:w16cex="http://schemas.microsoft.com/office/word/2018/wordml/cex" xmlns:w16cid="http://schemas.microsoft.com/office/word/2016/wordml/cid" xmlns:w16="http://schemas.microsoft.com/office/word/2018/wordml" xmlns:w16du="http://schemas.microsoft.com/office/word/2023/wordml/word16du" xmlns:w16sdtdh="http://schemas.microsoft.com/office/word/2020/wordml/sdtdatahash" xmlns:w16sdtfl="http://schemas.microsoft.com/office/word/2024/wordml/sdtformatlock" xmlns:w16se="http://schemas.microsoft.com/office/word/2015/wordml/symex" xmlns:wpg="http://schemas.microsoft.com/office/word/2010/wordprocessingGroup" xmlns:wpi="http://schemas.microsoft.com/office/word/2010/wordprocessingInk" xmlns:wne="http://schemas.microsoft.com/office/word/2006/wordml" xmlns:wps="http://schemas.microsoft.com/office/word/2010/wordprocessingShape" mc:Ignorable="w14 w15 w16se w16cid w16 w16cex w16sdtdh w16sdtfl w16du wp14">
   <w:p>
     <w:pPr>
       <w:pBdr>
@@ -177,7 +269,7 @@
                   <pic:cNvPicPr/>
                 </pic:nvPicPr>
                 <pic:blipFill rotWithShape="1">
-                  <a:blip r:embed="rIdTplImgC">
+                  <a:blip r:embed="rId1">
                     <a:extLst>
                       <a:ext uri="{28A0092B-C50C-407E-A947-70E740481C1C}">
                         <a14:useLocalDpi xmlns:a14="http://schemas.microsoft.com/office/drawing/2010/main" val="0"/>
@@ -242,7 +334,25 @@
         <w:sz w:val="16"/>
         <w:szCs w:val="16"/>
       </w:rPr>
-      <w:t xml:space="preserve">  eCRF 19: Gebruikershandleiding MoveMonitor </w:t>
+      <w:t xml:space="preserve">  eCRF 19: Gebruikershandleiding </w:t>
+    </w:r>
+    <w:proofErr w:type="spellStart"/>
+    <w:r>
+      <w:rPr>
+        <w:color w:val="59636E"/>
+        <w:sz w:val="16"/>
+        <w:szCs w:val="16"/>
+      </w:rPr>
+      <w:t>MoveMonitor</w:t>
+    </w:r>
+    <w:proofErr w:type="spellEnd"/>
+    <w:r>
+      <w:rPr>
+        <w:color w:val="59636E"/>
+        <w:sz w:val="16"/>
+        <w:szCs w:val="16"/>
+      </w:rPr>
+      <w:t xml:space="preserve"> </w:t>
     </w:r>
     <w:proofErr w:type="gramStart"/>
     <w:r>
@@ -251,7 +361,7 @@
         <w:sz w:val="16"/>
         <w:szCs w:val="16"/>
       </w:rPr>
-      <w:t>·</w:t>
+      <w:t>·  Versie</w:t>
     </w:r>
     <w:proofErr w:type="gramEnd"/>
     <w:r>
@@ -260,7 +370,7 @@
         <w:sz w:val="16"/>
         <w:szCs w:val="16"/>
       </w:rPr>
-      <w:t xml:space="preserve">  Versie </w:t>
+      <w:t xml:space="preserve"> </w:t>
     </w:r>
     <w:proofErr w:type="gramStart"/>
     <w:r>
@@ -497,17 +607,17 @@
 </file>
 
 <file path=word/footer3.xml><?xml version="1.0" encoding="utf-8"?>
-<w:ftr xmlns:wpc="http://schemas.microsoft.com/office/word/2010/wordprocessingCanvas" xmlns:cx="http://schemas.microsoft.com/office/drawing/2014/chartex" xmlns:cx1="http://schemas.microsoft.com/office/drawing/2015/9/8/chartex" xmlns:cx2="http://schemas.microsoft.com/office/drawing/2015/10/21/chartex" xmlns:cx3="http://schemas.microsoft.com/office/drawing/2016/5/9/chartex" xmlns:cx4="http://schemas.microsoft.com/office/drawing/2016/5/10/chartex" xmlns:cx5="http://schemas.microsoft.com/office/drawing/2016/5/11/chartex" xmlns:cx6="http://schemas.microsoft.com/office/drawing/2016/5/12/chartex" xmlns:cx7="http://schemas.microsoft.com/office/drawing/2016/5/13/chartex" xmlns:cx8="http://schemas.microsoft.com/office/drawing/2016/5/14/chartex" xmlns:mc="http://schemas.openxmlformats.org/markup-compatibility/2006" xmlns:aink="http://schemas.microsoft.com/office/drawing/2016/ink" xmlns:am3d="http://schemas.microsoft.com/office/drawing/2017/model3d" xmlns:o="urn:schemas-microsoft-com:office:office" xmlns:oel="http://schemas.microsoft.com/office/2019/extlst" xmlns:r="http://schemas.openxmlformats.org/officeDocument/2006/relationships" xmlns:m="http://schemas.openxmlformats.org/officeDocument/2006/math" xmlns:v="urn:schemas-microsoft-com:vml" xmlns:wp14="http://schemas.microsoft.com/office/word/2010/wordprocessingDrawing" xmlns:wp="http://schemas.openxmlformats.org/drawingml/2006/wordprocessingDrawing" xmlns:w10="urn:schemas-microsoft-com:office:word" xmlns:w="http://schemas.openxmlformats.org/wordprocessingml/2006/main" xmlns:w14="http://schemas.microsoft.com/office/word/2010/wordml" xmlns:w15="http://schemas.microsoft.com/office/word/2012/wordml" xmlns:w16cex="http://schemas.microsoft.com/office/word/2018/wordml/cex" xmlns:w16cid="http://schemas.microsoft.com/office/word/2016/wordml/cid" xmlns:w16="http://schemas.microsoft.com/office/word/2018/wordml" xmlns:w16du="http://schemas.microsoft.com/office/word/2023/wordml/word16du" xmlns:w16sdtdh="http://schemas.microsoft.com/office/word/2020/wordml/sdtdatahash" xmlns:w16sdtfl="http://schemas.microsoft.com/office/word/2024/wordml/sdtformatlock" xmlns:w16se="http://schemas.microsoft.com/office/word/2015/wordml/symex" xmlns:wpg="http://schemas.microsoft.com/office/word/2010/wordprocessingGroup" xmlns:wpi="http://schemas.microsoft.com/office/word/2010/wordprocessingInk" xmlns:wne="http://schemas.microsoft.com/office/word/2006/wordml" xmlns:wps="http://schemas.microsoft.com/office/word/2010/wordprocessingShape" mc:Ignorable="w14 w15 w16se w16cid w16 w16cex w16sdtdh w16sdtfl w16du wp14">
+<w:ftr xmlns:wpc="http://schemas.microsoft.com/office/word/2010/wordprocessingCanvas" xmlns:cx="http://schemas.microsoft.com/office/drawing/2014/chartex" xmlns:cx1="http://schemas.microsoft.com/office/drawing/2015/9/8/chartex" xmlns:cx2="http://schemas.microsoft.com/office/drawing/2015/10/21/chartex" xmlns:cx3="http://schemas.microsoft.com/office/drawing/2016/5/9/chartex" xmlns:cx4="http://schemas.microsoft.com/office/drawing/2016/5/10/chartex" xmlns:cx5="http://schemas.microsoft.com/office/drawing/2016/5/11/chartex" xmlns:cx6="http://schemas.microsoft.com/office/drawing/2016/5/12/chartex" xmlns:cx7="http://schemas.microsoft.com/office/drawing/2016/5/13/chartex" xmlns:cx8="http://schemas.microsoft.com/office/drawing/2016/5/14/chartex" xmlns:mc="http://schemas.openxmlformats.org/markup-compatibility/2006" xmlns:aink="http://schemas.microsoft.com/office/drawing/2016/ink" xmlns:am3d="http://schemas.microsoft.com/office/drawing/2017/model3d" xmlns:o="urn:schemas-microsoft-com:office:office" xmlns:oel="http://schemas.microsoft.com/office/2019/extlst" xmlns:r="http://schemas.openxmlformats.org/officeDocument/2006/relationships" xmlns:m="http://schemas.openxmlformats.org/officeDocument/2006/math" xmlns:v="urn:schemas-microsoft-com:vml" xmlns:wp14="http://schemas.microsoft.com/office/word/2010/wordprocessingDrawing" xmlns:wp="http://schemas.openxmlformats.org/drawingml/2006/wordprocessingDrawing" xmlns:w10="urn:schemas-microsoft-com:office:word" xmlns:w="http://schemas.openxmlformats.org/wordprocessingml/2006/main" xmlns:w14="http://schemas.microsoft.com/office/word/2010/wordml" xmlns:w15="http://schemas.microsoft.com/office/word/2012/wordml" xmlns:w16cei="http://schemas.microsoft.com/office/word/2026/wordml/cei" xmlns:w16cex="http://schemas.microsoft.com/office/word/2018/wordml/cex" xmlns:w16cid="http://schemas.microsoft.com/office/word/2016/wordml/cid" xmlns:w16="http://schemas.microsoft.com/office/word/2018/wordml" xmlns:w16du="http://schemas.microsoft.com/office/word/2023/wordml/word16du" xmlns:w16sdtdh="http://schemas.microsoft.com/office/word/2020/wordml/sdtdatahash" xmlns:w16sdtfl="http://schemas.microsoft.com/office/word/2024/wordml/sdtformatlock" xmlns:w16se="http://schemas.microsoft.com/office/word/2015/wordml/symex" xmlns:wpg="http://schemas.microsoft.com/office/word/2010/wordprocessingGroup" xmlns:wpi="http://schemas.microsoft.com/office/word/2010/wordprocessingInk" xmlns:wne="http://schemas.microsoft.com/office/word/2006/wordml" xmlns:wps="http://schemas.microsoft.com/office/word/2010/wordprocessingShape" mc:Ignorable="w14 w15 w16se w16cid w16 w16cex w16sdtdh w16sdtfl w16du wp14">
   <w:p>
     <w:pPr>
-      <w:pStyle w:val="Footer"/>
+      <w:pStyle w:val="Voettekst"/>
     </w:pPr>
   </w:p>
 </w:ftr>
 </file>
 
 <file path=word/footnotes.xml><?xml version="1.0" encoding="utf-8"?>
-<w:footnotes xmlns:wpc="http://schemas.microsoft.com/office/word/2010/wordprocessingCanvas" xmlns:cx="http://schemas.microsoft.com/office/drawing/2014/chartex" xmlns:cx1="http://schemas.microsoft.com/office/drawing/2015/9/8/chartex" xmlns:cx2="http://schemas.microsoft.com/office/drawing/2015/10/21/chartex" xmlns:cx3="http://schemas.microsoft.com/office/drawing/2016/5/9/chartex" xmlns:cx4="http://schemas.microsoft.com/office/drawing/2016/5/10/chartex" xmlns:cx5="http://schemas.microsoft.com/office/drawing/2016/5/11/chartex" xmlns:cx6="http://schemas.microsoft.com/office/drawing/2016/5/12/chartex" xmlns:cx7="http://schemas.microsoft.com/office/drawing/2016/5/13/chartex" xmlns:cx8="http://schemas.microsoft.com/office/drawing/2016/5/14/chartex" xmlns:mc="http://schemas.openxmlformats.org/markup-compatibility/2006" xmlns:aink="http://schemas.microsoft.com/office/drawing/2016/ink" xmlns:am3d="http://schemas.microsoft.com/office/drawing/2017/model3d" xmlns:o="urn:schemas-microsoft-com:office:office" xmlns:oel="http://schemas.microsoft.com/office/2019/extlst" xmlns:r="http://schemas.openxmlformats.org/officeDocument/2006/relationships" xmlns:m="http://schemas.openxmlformats.org/officeDocument/2006/math" xmlns:v="urn:schemas-microsoft-com:vml" xmlns:wp14="http://schemas.microsoft.com/office/word/2010/wordprocessingDrawing" xmlns:wp="http://schemas.openxmlformats.org/drawingml/2006/wordprocessingDrawing" xmlns:w10="urn:schemas-microsoft-com:office:word" xmlns:w="http://schemas.openxmlformats.org/wordprocessingml/2006/main" xmlns:w14="http://schemas.microsoft.com/office/word/2010/wordml" xmlns:w15="http://schemas.microsoft.com/office/word/2012/wordml" xmlns:w16cex="http://schemas.microsoft.com/office/word/2018/wordml/cex" xmlns:w16cid="http://schemas.microsoft.com/office/word/2016/wordml/cid" xmlns:w16="http://schemas.microsoft.com/office/word/2018/wordml" xmlns:w16du="http://schemas.microsoft.com/office/word/2023/wordml/word16du" xmlns:w16sdtdh="http://schemas.microsoft.com/office/word/2020/wordml/sdtdatahash" xmlns:w16sdtfl="http://schemas.microsoft.com/office/word/2024/wordml/sdtformatlock" xmlns:w16se="http://schemas.microsoft.com/office/word/2015/wordml/symex" xmlns:wpg="http://schemas.microsoft.com/office/word/2010/wordprocessingGroup" xmlns:wpi="http://schemas.microsoft.com/office/word/2010/wordprocessingInk" xmlns:wne="http://schemas.microsoft.com/office/word/2006/wordml" xmlns:wps="http://schemas.microsoft.com/office/word/2010/wordprocessingShape" mc:Ignorable="w14 w15 w16se w16cid w16 w16cex w16sdtdh w16sdtfl w16du wp14">
+<w:footnotes xmlns:wpc="http://schemas.microsoft.com/office/word/2010/wordprocessingCanvas" xmlns:cx="http://schemas.microsoft.com/office/drawing/2014/chartex" xmlns:cx1="http://schemas.microsoft.com/office/drawing/2015/9/8/chartex" xmlns:cx2="http://schemas.microsoft.com/office/drawing/2015/10/21/chartex" xmlns:cx3="http://schemas.microsoft.com/office/drawing/2016/5/9/chartex" xmlns:cx4="http://schemas.microsoft.com/office/drawing/2016/5/10/chartex" xmlns:cx5="http://schemas.microsoft.com/office/drawing/2016/5/11/chartex" xmlns:cx6="http://schemas.microsoft.com/office/drawing/2016/5/12/chartex" xmlns:cx7="http://schemas.microsoft.com/office/drawing/2016/5/13/chartex" xmlns:cx8="http://schemas.microsoft.com/office/drawing/2016/5/14/chartex" xmlns:mc="http://schemas.openxmlformats.org/markup-compatibility/2006" xmlns:aink="http://schemas.microsoft.com/office/drawing/2016/ink" xmlns:am3d="http://schemas.microsoft.com/office/drawing/2017/model3d" xmlns:o="urn:schemas-microsoft-com:office:office" xmlns:oel="http://schemas.microsoft.com/office/2019/extlst" xmlns:r="http://schemas.openxmlformats.org/officeDocument/2006/relationships" xmlns:m="http://schemas.openxmlformats.org/officeDocument/2006/math" xmlns:v="urn:schemas-microsoft-com:vml" xmlns:wp14="http://schemas.microsoft.com/office/word/2010/wordprocessingDrawing" xmlns:wp="http://schemas.openxmlformats.org/drawingml/2006/wordprocessingDrawing" xmlns:w10="urn:schemas-microsoft-com:office:word" xmlns:w="http://schemas.openxmlformats.org/wordprocessingml/2006/main" xmlns:w14="http://schemas.microsoft.com/office/word/2010/wordml" xmlns:w15="http://schemas.microsoft.com/office/word/2012/wordml" xmlns:w16cei="http://schemas.microsoft.com/office/word/2026/wordml/cei" xmlns:w16cex="http://schemas.microsoft.com/office/word/2018/wordml/cex" xmlns:w16cid="http://schemas.microsoft.com/office/word/2016/wordml/cid" xmlns:w16="http://schemas.microsoft.com/office/word/2018/wordml" xmlns:w16du="http://schemas.microsoft.com/office/word/2023/wordml/word16du" xmlns:w16sdtdh="http://schemas.microsoft.com/office/word/2020/wordml/sdtdatahash" xmlns:w16sdtfl="http://schemas.microsoft.com/office/word/2024/wordml/sdtformatlock" xmlns:w16se="http://schemas.microsoft.com/office/word/2015/wordml/symex" xmlns:wpg="http://schemas.microsoft.com/office/word/2010/wordprocessingGroup" xmlns:wpi="http://schemas.microsoft.com/office/word/2010/wordprocessingInk" xmlns:wne="http://schemas.microsoft.com/office/word/2006/wordml" xmlns:wps="http://schemas.microsoft.com/office/word/2010/wordprocessingShape" mc:Ignorable="w14 w15 w16se w16cid w16 w16cex w16sdtdh w16sdtfl w16du wp14">
   <w:footnote w:type="separator" w:id="-1">
     <w:p>
       <w:pPr>
@@ -526,20 +636,19 @@
 </file>
 
 <file path=word/header1.xml><?xml version="1.0" encoding="utf-8"?>
-<w:hdr xmlns:wpc="http://schemas.microsoft.com/office/word/2010/wordprocessingCanvas" xmlns:cx="http://schemas.microsoft.com/office/drawing/2014/chartex" xmlns:cx1="http://schemas.microsoft.com/office/drawing/2015/9/8/chartex" xmlns:cx2="http://schemas.microsoft.com/office/drawing/2015/10/21/chartex" xmlns:cx3="http://schemas.microsoft.com/office/drawing/2016/5/9/chartex" xmlns:cx4="http://schemas.microsoft.com/office/drawing/2016/5/10/chartex" xmlns:cx5="http://schemas.microsoft.com/office/drawing/2016/5/11/chartex" xmlns:cx6="http://schemas.microsoft.com/office/drawing/2016/5/12/chartex" xmlns:cx7="http://schemas.microsoft.com/office/drawing/2016/5/13/chartex" xmlns:cx8="http://schemas.microsoft.com/office/drawing/2016/5/14/chartex" xmlns:mc="http://schemas.openxmlformats.org/markup-compatibility/2006" xmlns:aink="http://schemas.microsoft.com/office/drawing/2016/ink" xmlns:am3d="http://schemas.microsoft.com/office/drawing/2017/model3d" xmlns:o="urn:schemas-microsoft-com:office:office" xmlns:oel="http://schemas.microsoft.com/office/2019/extlst" xmlns:r="http://schemas.openxmlformats.org/officeDocument/2006/relationships" xmlns:m="http://schemas.openxmlformats.org/officeDocument/2006/math" xmlns:v="urn:schemas-microsoft-com:vml" xmlns:wp14="http://schemas.microsoft.com/office/word/2010/wordprocessingDrawing" xmlns:wp="http://schemas.openxmlformats.org/drawingml/2006/wordprocessingDrawing" xmlns:w10="urn:schemas-microsoft-com:office:word" xmlns:w="http://schemas.openxmlformats.org/wordprocessingml/2006/main" xmlns:w14="http://schemas.microsoft.com/office/word/2010/wordml" xmlns:w15="http://schemas.microsoft.com/office/word/2012/wordml" xmlns:w16cex="http://schemas.microsoft.com/office/word/2018/wordml/cex" xmlns:w16cid="http://schemas.microsoft.com/office/word/2016/wordml/cid" xmlns:w16="http://schemas.microsoft.com/office/word/2018/wordml" xmlns:w16du="http://schemas.microsoft.com/office/word/2023/wordml/word16du" xmlns:w16sdtdh="http://schemas.microsoft.com/office/word/2020/wordml/sdtdatahash" xmlns:w16sdtfl="http://schemas.microsoft.com/office/word/2024/wordml/sdtformatlock" xmlns:w16se="http://schemas.microsoft.com/office/word/2015/wordml/symex" xmlns:wpg="http://schemas.microsoft.com/office/word/2010/wordprocessingGroup" xmlns:wpi="http://schemas.microsoft.com/office/word/2010/wordprocessingInk" xmlns:wne="http://schemas.microsoft.com/office/word/2006/wordml" xmlns:wps="http://schemas.microsoft.com/office/word/2010/wordprocessingShape" mc:Ignorable="w14 w15 w16se w16cid w16 w16cex w16sdtdh w16sdtfl w16du wp14">
+<w:hdr xmlns:wpc="http://schemas.microsoft.com/office/word/2010/wordprocessingCanvas" xmlns:cx="http://schemas.microsoft.com/office/drawing/2014/chartex" xmlns:cx1="http://schemas.microsoft.com/office/drawing/2015/9/8/chartex" xmlns:cx2="http://schemas.microsoft.com/office/drawing/2015/10/21/chartex" xmlns:cx3="http://schemas.microsoft.com/office/drawing/2016/5/9/chartex" xmlns:cx4="http://schemas.microsoft.com/office/drawing/2016/5/10/chartex" xmlns:cx5="http://schemas.microsoft.com/office/drawing/2016/5/11/chartex" xmlns:cx6="http://schemas.microsoft.com/office/drawing/2016/5/12/chartex" xmlns:cx7="http://schemas.microsoft.com/office/drawing/2016/5/13/chartex" xmlns:cx8="http://schemas.microsoft.com/office/drawing/2016/5/14/chartex" xmlns:mc="http://schemas.openxmlformats.org/markup-compatibility/2006" xmlns:aink="http://schemas.microsoft.com/office/drawing/2016/ink" xmlns:am3d="http://schemas.microsoft.com/office/drawing/2017/model3d" xmlns:o="urn:schemas-microsoft-com:office:office" xmlns:oel="http://schemas.microsoft.com/office/2019/extlst" xmlns:r="http://schemas.openxmlformats.org/officeDocument/2006/relationships" xmlns:m="http://schemas.openxmlformats.org/officeDocument/2006/math" xmlns:v="urn:schemas-microsoft-com:vml" xmlns:wp14="http://schemas.microsoft.com/office/word/2010/wordprocessingDrawing" xmlns:wp="http://schemas.openxmlformats.org/drawingml/2006/wordprocessingDrawing" xmlns:w10="urn:schemas-microsoft-com:office:word" xmlns:w="http://schemas.openxmlformats.org/wordprocessingml/2006/main" xmlns:w14="http://schemas.microsoft.com/office/word/2010/wordml" xmlns:w15="http://schemas.microsoft.com/office/word/2012/wordml" xmlns:w16cei="http://schemas.microsoft.com/office/word/2026/wordml/cei" xmlns:w16cex="http://schemas.microsoft.com/office/word/2018/wordml/cex" xmlns:w16cid="http://schemas.microsoft.com/office/word/2016/wordml/cid" xmlns:w16="http://schemas.microsoft.com/office/word/2018/wordml" xmlns:w16du="http://schemas.microsoft.com/office/word/2023/wordml/word16du" xmlns:w16sdtdh="http://schemas.microsoft.com/office/word/2020/wordml/sdtdatahash" xmlns:w16sdtfl="http://schemas.microsoft.com/office/word/2024/wordml/sdtformatlock" xmlns:w16se="http://schemas.microsoft.com/office/word/2015/wordml/symex" xmlns:wpg="http://schemas.microsoft.com/office/word/2010/wordprocessingGroup" xmlns:wpi="http://schemas.microsoft.com/office/word/2010/wordprocessingInk" xmlns:wne="http://schemas.microsoft.com/office/word/2006/wordml" xmlns:wps="http://schemas.microsoft.com/office/word/2010/wordprocessingShape" mc:Ignorable="w14 w15 w16se w16cid w16 w16cex w16sdtdh w16sdtfl w16du wp14">
   <w:p>
     <w:pPr>
-      <w:pStyle w:val="Header"/>
+      <w:pStyle w:val="Koptekst"/>
     </w:pPr>
   </w:p>
 </w:hdr>
 </file>
 
 <file path=word/header2.xml><?xml version="1.0" encoding="utf-8"?>
-<w:hdr xmlns:wpc="http://schemas.microsoft.com/office/word/2010/wordprocessingCanvas" xmlns:cx="http://schemas.microsoft.com/office/drawing/2014/chartex" xmlns:cx1="http://schemas.microsoft.com/office/drawing/2015/9/8/chartex" xmlns:cx2="http://schemas.microsoft.com/office/drawing/2015/10/21/chartex" xmlns:cx3="http://schemas.microsoft.com/office/drawing/2016/5/9/chartex" xmlns:cx4="http://schemas.microsoft.com/office/drawing/2016/5/10/chartex" xmlns:cx5="http://schemas.microsoft.com/office/drawing/2016/5/11/chartex" xmlns:cx6="http://schemas.microsoft.com/office/drawing/2016/5/12/chartex" xmlns:cx7="http://schemas.microsoft.com/office/drawing/2016/5/13/chartex" xmlns:cx8="http://schemas.microsoft.com/office/drawing/2016/5/14/chartex" xmlns:mc="http://schemas.openxmlformats.org/markup-compatibility/2006" xmlns:aink="http://schemas.microsoft.com/office/drawing/2016/ink" xmlns:am3d="http://schemas.microsoft.com/office/drawing/2017/model3d" xmlns:o="urn:schemas-microsoft-com:office:office" xmlns:oel="http://schemas.microsoft.com/office/2019/extlst" xmlns:r="http://schemas.openxmlformats.org/officeDocument/2006/relationships" xmlns:m="http://schemas.openxmlformats.org/officeDocument/2006/math" xmlns:v="urn:schemas-microsoft-com:vml" xmlns:wp14="http://schemas.microsoft.com/office/word/2010/wordprocessingDrawing" xmlns:wp="http://schemas.openxmlformats.org/drawingml/2006/wordprocessingDrawing" xmlns:w10="urn:schemas-microsoft-com:office:word" xmlns:w="http://schemas.openxmlformats.org/wordprocessingml/2006/main" xmlns:w14="http://schemas.microsoft.com/office/word/2010/wordml" xmlns:w15="http://schemas.microsoft.com/office/word/2012/wordml" xmlns:w16cex="http://schemas.microsoft.com/office/word/2018/wordml/cex" xmlns:w16cid="http://schemas.microsoft.com/office/word/2016/wordml/cid" xmlns:w16="http://schemas.microsoft.com/office/word/2018/wordml" xmlns:w16du="http://schemas.microsoft.com/office/word/2023/wordml/word16du" xmlns:w16sdtdh="http://schemas.microsoft.com/office/word/2020/wordml/sdtdatahash" xmlns:w16sdtfl="http://schemas.microsoft.com/office/word/2024/wordml/sdtformatlock" xmlns:w16se="http://schemas.microsoft.com/office/word/2015/wordml/symex" xmlns:wpg="http://schemas.microsoft.com/office/word/2010/wordprocessingGroup" xmlns:wpi="http://schemas.microsoft.com/office/word/2010/wordprocessingInk" xmlns:wne="http://schemas.microsoft.com/office/word/2006/wordml" xmlns:wps="http://schemas.microsoft.com/office/word/2010/wordprocessingShape" mc:Ignorable="w14 w15 w16se w16cid w16 w16cex w16sdtdh w16sdtfl w16du wp14">
+<w:hdr xmlns:wpc="http://schemas.microsoft.com/office/word/2010/wordprocessingCanvas" xmlns:cx="http://schemas.microsoft.com/office/drawing/2014/chartex" xmlns:cx1="http://schemas.microsoft.com/office/drawing/2015/9/8/chartex" xmlns:cx2="http://schemas.microsoft.com/office/drawing/2015/10/21/chartex" xmlns:cx3="http://schemas.microsoft.com/office/drawing/2016/5/9/chartex" xmlns:cx4="http://schemas.microsoft.com/office/drawing/2016/5/10/chartex" xmlns:cx5="http://schemas.microsoft.com/office/drawing/2016/5/11/chartex" xmlns:cx6="http://schemas.microsoft.com/office/drawing/2016/5/12/chartex" xmlns:cx7="http://schemas.microsoft.com/office/drawing/2016/5/13/chartex" xmlns:cx8="http://schemas.microsoft.com/office/drawing/2016/5/14/chartex" xmlns:mc="http://schemas.openxmlformats.org/markup-compatibility/2006" xmlns:aink="http://schemas.microsoft.com/office/drawing/2016/ink" xmlns:am3d="http://schemas.microsoft.com/office/drawing/2017/model3d" xmlns:o="urn:schemas-microsoft-com:office:office" xmlns:oel="http://schemas.microsoft.com/office/2019/extlst" xmlns:r="http://schemas.openxmlformats.org/officeDocument/2006/relationships" xmlns:m="http://schemas.openxmlformats.org/officeDocument/2006/math" xmlns:v="urn:schemas-microsoft-com:vml" xmlns:wp14="http://schemas.microsoft.com/office/word/2010/wordprocessingDrawing" xmlns:wp="http://schemas.openxmlformats.org/drawingml/2006/wordprocessingDrawing" xmlns:w10="urn:schemas-microsoft-com:office:word" xmlns:w="http://schemas.openxmlformats.org/wordprocessingml/2006/main" xmlns:w14="http://schemas.microsoft.com/office/word/2010/wordml" xmlns:w15="http://schemas.microsoft.com/office/word/2012/wordml" xmlns:w16cei="http://schemas.microsoft.com/office/word/2026/wordml/cei" xmlns:w16cex="http://schemas.microsoft.com/office/word/2018/wordml/cex" xmlns:w16cid="http://schemas.microsoft.com/office/word/2016/wordml/cid" xmlns:w16="http://schemas.microsoft.com/office/word/2018/wordml" xmlns:w16du="http://schemas.microsoft.com/office/word/2023/wordml/word16du" xmlns:w16sdtdh="http://schemas.microsoft.com/office/word/2020/wordml/sdtdatahash" xmlns:w16sdtfl="http://schemas.microsoft.com/office/word/2024/wordml/sdtformatlock" xmlns:w16se="http://schemas.microsoft.com/office/word/2015/wordml/symex" xmlns:wpg="http://schemas.microsoft.com/office/word/2010/wordprocessingGroup" xmlns:wpi="http://schemas.microsoft.com/office/word/2010/wordprocessingInk" xmlns:wne="http://schemas.microsoft.com/office/word/2006/wordml" xmlns:wps="http://schemas.microsoft.com/office/word/2010/wordprocessingShape" mc:Ignorable="w14 w15 w16se w16cid w16 w16cex w16sdtdh w16sdtfl w16du wp14">
   <w:p>
     <w:pPr>
-      <w:pStyle w:val="Koptekst"/>
       <w:jc w:val="right"/>
     </w:pPr>
     <w:r>
@@ -583,7 +692,7 @@
                   <pic:cNvPicPr/>
                 </pic:nvPicPr>
                 <pic:blipFill>
-                  <a:blip r:embed="rIdTplImgA">
+                  <a:blip r:embed="rId1">
                     <a:extLst>
                       <a:ext uri="{28A0092B-C50C-407E-A947-70E740481C1C}">
                         <a14:useLocalDpi xmlns:a14="http://schemas.microsoft.com/office/drawing/2010/main" val="0"/>
@@ -635,7 +744,7 @@
                   <pic:cNvPicPr/>
                 </pic:nvPicPr>
                 <pic:blipFill>
-                  <a:blip r:embed="rIdTplImgB">
+                  <a:blip r:embed="rId2">
                     <a:extLst>
                       <a:ext uri="{28A0092B-C50C-407E-A947-70E740481C1C}">
                         <a14:useLocalDpi xmlns:a14="http://schemas.microsoft.com/office/drawing/2010/main" val="0"/>
@@ -666,17 +775,17 @@
 </file>
 
 <file path=word/header3.xml><?xml version="1.0" encoding="utf-8"?>
-<w:hdr xmlns:wpc="http://schemas.microsoft.com/office/word/2010/wordprocessingCanvas" xmlns:cx="http://schemas.microsoft.com/office/drawing/2014/chartex" xmlns:cx1="http://schemas.microsoft.com/office/drawing/2015/9/8/chartex" xmlns:cx2="http://schemas.microsoft.com/office/drawing/2015/10/21/chartex" xmlns:cx3="http://schemas.microsoft.com/office/drawing/2016/5/9/chartex" xmlns:cx4="http://schemas.microsoft.com/office/drawing/2016/5/10/chartex" xmlns:cx5="http://schemas.microsoft.com/office/drawing/2016/5/11/chartex" xmlns:cx6="http://schemas.microsoft.com/office/drawing/2016/5/12/chartex" xmlns:cx7="http://schemas.microsoft.com/office/drawing/2016/5/13/chartex" xmlns:cx8="http://schemas.microsoft.com/office/drawing/2016/5/14/chartex" xmlns:mc="http://schemas.openxmlformats.org/markup-compatibility/2006" xmlns:aink="http://schemas.microsoft.com/office/drawing/2016/ink" xmlns:am3d="http://schemas.microsoft.com/office/drawing/2017/model3d" xmlns:o="urn:schemas-microsoft-com:office:office" xmlns:oel="http://schemas.microsoft.com/office/2019/extlst" xmlns:r="http://schemas.openxmlformats.org/officeDocument/2006/relationships" xmlns:m="http://schemas.openxmlformats.org/officeDocument/2006/math" xmlns:v="urn:schemas-microsoft-com:vml" xmlns:wp14="http://schemas.microsoft.com/office/word/2010/wordprocessingDrawing" xmlns:wp="http://schemas.openxmlformats.org/drawingml/2006/wordprocessingDrawing" xmlns:w10="urn:schemas-microsoft-com:office:word" xmlns:w="http://schemas.openxmlformats.org/wordprocessingml/2006/main" xmlns:w14="http://schemas.microsoft.com/office/word/2010/wordml" xmlns:w15="http://schemas.microsoft.com/office/word/2012/wordml" xmlns:w16cex="http://schemas.microsoft.com/office/word/2018/wordml/cex" xmlns:w16cid="http://schemas.microsoft.com/office/word/2016/wordml/cid" xmlns:w16="http://schemas.microsoft.com/office/word/2018/wordml" xmlns:w16du="http://schemas.microsoft.com/office/word/2023/wordml/word16du" xmlns:w16sdtdh="http://schemas.microsoft.com/office/word/2020/wordml/sdtdatahash" xmlns:w16sdtfl="http://schemas.microsoft.com/office/word/2024/wordml/sdtformatlock" xmlns:w16se="http://schemas.microsoft.com/office/word/2015/wordml/symex" xmlns:wpg="http://schemas.microsoft.com/office/word/2010/wordprocessingGroup" xmlns:wpi="http://schemas.microsoft.com/office/word/2010/wordprocessingInk" xmlns:wne="http://schemas.microsoft.com/office/word/2006/wordml" xmlns:wps="http://schemas.microsoft.com/office/word/2010/wordprocessingShape" mc:Ignorable="w14 w15 w16se w16cid w16 w16cex w16sdtdh w16sdtfl w16du wp14">
+<w:hdr xmlns:wpc="http://schemas.microsoft.com/office/word/2010/wordprocessingCanvas" xmlns:cx="http://schemas.microsoft.com/office/drawing/2014/chartex" xmlns:cx1="http://schemas.microsoft.com/office/drawing/2015/9/8/chartex" xmlns:cx2="http://schemas.microsoft.com/office/drawing/2015/10/21/chartex" xmlns:cx3="http://schemas.microsoft.com/office/drawing/2016/5/9/chartex" xmlns:cx4="http://schemas.microsoft.com/office/drawing/2016/5/10/chartex" xmlns:cx5="http://schemas.microsoft.com/office/drawing/2016/5/11/chartex" xmlns:cx6="http://schemas.microsoft.com/office/drawing/2016/5/12/chartex" xmlns:cx7="http://schemas.microsoft.com/office/drawing/2016/5/13/chartex" xmlns:cx8="http://schemas.microsoft.com/office/drawing/2016/5/14/chartex" xmlns:mc="http://schemas.openxmlformats.org/markup-compatibility/2006" xmlns:aink="http://schemas.microsoft.com/office/drawing/2016/ink" xmlns:am3d="http://schemas.microsoft.com/office/drawing/2017/model3d" xmlns:o="urn:schemas-microsoft-com:office:office" xmlns:oel="http://schemas.microsoft.com/office/2019/extlst" xmlns:r="http://schemas.openxmlformats.org/officeDocument/2006/relationships" xmlns:m="http://schemas.openxmlformats.org/officeDocument/2006/math" xmlns:v="urn:schemas-microsoft-com:vml" xmlns:wp14="http://schemas.microsoft.com/office/word/2010/wordprocessingDrawing" xmlns:wp="http://schemas.openxmlformats.org/drawingml/2006/wordprocessingDrawing" xmlns:w10="urn:schemas-microsoft-com:office:word" xmlns:w="http://schemas.openxmlformats.org/wordprocessingml/2006/main" xmlns:w14="http://schemas.microsoft.com/office/word/2010/wordml" xmlns:w15="http://schemas.microsoft.com/office/word/2012/wordml" xmlns:w16cei="http://schemas.microsoft.com/office/word/2026/wordml/cei" xmlns:w16cex="http://schemas.microsoft.com/office/word/2018/wordml/cex" xmlns:w16cid="http://schemas.microsoft.com/office/word/2016/wordml/cid" xmlns:w16="http://schemas.microsoft.com/office/word/2018/wordml" xmlns:w16du="http://schemas.microsoft.com/office/word/2023/wordml/word16du" xmlns:w16sdtdh="http://schemas.microsoft.com/office/word/2020/wordml/sdtdatahash" xmlns:w16sdtfl="http://schemas.microsoft.com/office/word/2024/wordml/sdtformatlock" xmlns:w16se="http://schemas.microsoft.com/office/word/2015/wordml/symex" xmlns:wpg="http://schemas.microsoft.com/office/word/2010/wordprocessingGroup" xmlns:wpi="http://schemas.microsoft.com/office/word/2010/wordprocessingInk" xmlns:wne="http://schemas.microsoft.com/office/word/2006/wordml" xmlns:wps="http://schemas.microsoft.com/office/word/2010/wordprocessingShape" mc:Ignorable="w14 w15 w16se w16cid w16 w16cex w16sdtdh w16sdtfl w16du wp14">
   <w:p>
     <w:pPr>
-      <w:pStyle w:val="Header"/>
+      <w:pStyle w:val="Koptekst"/>
     </w:pPr>
   </w:p>
 </w:hdr>
 </file>
 
 <file path=word/numbering.xml><?xml version="1.0" encoding="utf-8"?>
-<w:numbering xmlns:wpc="http://schemas.microsoft.com/office/word/2010/wordprocessingCanvas" xmlns:cx="http://schemas.microsoft.com/office/drawing/2014/chartex" xmlns:cx1="http://schemas.microsoft.com/office/drawing/2015/9/8/chartex" xmlns:cx2="http://schemas.microsoft.com/office/drawing/2015/10/21/chartex" xmlns:cx3="http://schemas.microsoft.com/office/drawing/2016/5/9/chartex" xmlns:cx4="http://schemas.microsoft.com/office/drawing/2016/5/10/chartex" xmlns:cx5="http://schemas.microsoft.com/office/drawing/2016/5/11/chartex" xmlns:cx6="http://schemas.microsoft.com/office/drawing/2016/5/12/chartex" xmlns:cx7="http://schemas.microsoft.com/office/drawing/2016/5/13/chartex" xmlns:cx8="http://schemas.microsoft.com/office/drawing/2016/5/14/chartex" xmlns:mc="http://schemas.openxmlformats.org/markup-compatibility/2006" xmlns:aink="http://schemas.microsoft.com/office/drawing/2016/ink" xmlns:am3d="http://schemas.microsoft.com/office/drawing/2017/model3d" xmlns:o="urn:schemas-microsoft-com:office:office" xmlns:oel="http://schemas.microsoft.com/office/2019/extlst" xmlns:r="http://schemas.openxmlformats.org/officeDocument/2006/relationships" xmlns:m="http://schemas.openxmlformats.org/officeDocument/2006/math" xmlns:v="urn:schemas-microsoft-com:vml" xmlns:wp14="http://schemas.microsoft.com/office/word/2010/wordprocessingDrawing" xmlns:wp="http://schemas.openxmlformats.org/drawingml/2006/wordprocessingDrawing" xmlns:w10="urn:schemas-microsoft-com:office:word" xmlns:w="http://schemas.openxmlformats.org/wordprocessingml/2006/main" xmlns:w14="http://schemas.microsoft.com/office/word/2010/wordml" xmlns:w15="http://schemas.microsoft.com/office/word/2012/wordml" xmlns:w16cex="http://schemas.microsoft.com/office/word/2018/wordml/cex" xmlns:w16cid="http://schemas.microsoft.com/office/word/2016/wordml/cid" xmlns:w16="http://schemas.microsoft.com/office/word/2018/wordml" xmlns:w16du="http://schemas.microsoft.com/office/word/2023/wordml/word16du" xmlns:w16sdtdh="http://schemas.microsoft.com/office/word/2020/wordml/sdtdatahash" xmlns:w16sdtfl="http://schemas.microsoft.com/office/word/2024/wordml/sdtformatlock" xmlns:w16se="http://schemas.microsoft.com/office/word/2015/wordml/symex" xmlns:wpg="http://schemas.microsoft.com/office/word/2010/wordprocessingGroup" xmlns:wpi="http://schemas.microsoft.com/office/word/2010/wordprocessingInk" xmlns:wne="http://schemas.microsoft.com/office/word/2006/wordml" xmlns:wps="http://schemas.microsoft.com/office/word/2010/wordprocessingShape" mc:Ignorable="w14 w15 w16se w16cid w16 w16cex w16sdtdh w16sdtfl w16du wp14">
+<w:numbering xmlns:wpc="http://schemas.microsoft.com/office/word/2010/wordprocessingCanvas" xmlns:cx="http://schemas.microsoft.com/office/drawing/2014/chartex" xmlns:cx1="http://schemas.microsoft.com/office/drawing/2015/9/8/chartex" xmlns:cx2="http://schemas.microsoft.com/office/drawing/2015/10/21/chartex" xmlns:cx3="http://schemas.microsoft.com/office/drawing/2016/5/9/chartex" xmlns:cx4="http://schemas.microsoft.com/office/drawing/2016/5/10/chartex" xmlns:cx5="http://schemas.microsoft.com/office/drawing/2016/5/11/chartex" xmlns:cx6="http://schemas.microsoft.com/office/drawing/2016/5/12/chartex" xmlns:cx7="http://schemas.microsoft.com/office/drawing/2016/5/13/chartex" xmlns:cx8="http://schemas.microsoft.com/office/drawing/2016/5/14/chartex" xmlns:mc="http://schemas.openxmlformats.org/markup-compatibility/2006" xmlns:aink="http://schemas.microsoft.com/office/drawing/2016/ink" xmlns:am3d="http://schemas.microsoft.com/office/drawing/2017/model3d" xmlns:o="urn:schemas-microsoft-com:office:office" xmlns:oel="http://schemas.microsoft.com/office/2019/extlst" xmlns:r="http://schemas.openxmlformats.org/officeDocument/2006/relationships" xmlns:m="http://schemas.openxmlformats.org/officeDocument/2006/math" xmlns:v="urn:schemas-microsoft-com:vml" xmlns:wp14="http://schemas.microsoft.com/office/word/2010/wordprocessingDrawing" xmlns:wp="http://schemas.openxmlformats.org/drawingml/2006/wordprocessingDrawing" xmlns:w10="urn:schemas-microsoft-com:office:word" xmlns:w="http://schemas.openxmlformats.org/wordprocessingml/2006/main" xmlns:w14="http://schemas.microsoft.com/office/word/2010/wordml" xmlns:w15="http://schemas.microsoft.com/office/word/2012/wordml" xmlns:w16cei="http://schemas.microsoft.com/office/word/2026/wordml/cei" xmlns:w16cex="http://schemas.microsoft.com/office/word/2018/wordml/cex" xmlns:w16cid="http://schemas.microsoft.com/office/word/2016/wordml/cid" xmlns:w16="http://schemas.microsoft.com/office/word/2018/wordml" xmlns:w16du="http://schemas.microsoft.com/office/word/2023/wordml/word16du" xmlns:w16sdtdh="http://schemas.microsoft.com/office/word/2020/wordml/sdtdatahash" xmlns:w16sdtfl="http://schemas.microsoft.com/office/word/2024/wordml/sdtformatlock" xmlns:w16se="http://schemas.microsoft.com/office/word/2015/wordml/symex" xmlns:wpg="http://schemas.microsoft.com/office/word/2010/wordprocessingGroup" xmlns:wpi="http://schemas.microsoft.com/office/word/2010/wordprocessingInk" xmlns:wne="http://schemas.microsoft.com/office/word/2006/wordml" xmlns:wps="http://schemas.microsoft.com/office/word/2010/wordprocessingShape" mc:Ignorable="w14 w15 w16se w16cid w16 w16cex w16sdtdh w16sdtfl w16du wp14">
   <w:abstractNum w:abstractNumId="0" w15:restartNumberingAfterBreak="0">
     <w:nsid w:val="03E752F1"/>
     <w:multiLevelType w:val="multilevel"/>
@@ -693,7 +802,7 @@
         <w:ind w:left="720" w:hanging="360"/>
       </w:pPr>
       <w:rPr>
-        <w:rFonts w:hint="default" w:ascii="Symbol" w:hAnsi="Symbol"/>
+        <w:rFonts w:ascii="Symbol" w:hAnsi="Symbol" w:hint="default"/>
         <w:sz w:val="20"/>
       </w:rPr>
     </w:lvl>
@@ -709,7 +818,7 @@
         <w:ind w:left="1440" w:hanging="360"/>
       </w:pPr>
       <w:rPr>
-        <w:rFonts w:hint="default" w:ascii="Courier New" w:hAnsi="Courier New"/>
+        <w:rFonts w:ascii="Courier New" w:hAnsi="Courier New" w:hint="default"/>
         <w:sz w:val="20"/>
       </w:rPr>
     </w:lvl>
@@ -725,7 +834,7 @@
         <w:ind w:left="2160" w:hanging="360"/>
       </w:pPr>
       <w:rPr>
-        <w:rFonts w:hint="default" w:ascii="Wingdings" w:hAnsi="Wingdings"/>
+        <w:rFonts w:ascii="Wingdings" w:hAnsi="Wingdings" w:hint="default"/>
         <w:sz w:val="20"/>
       </w:rPr>
     </w:lvl>
@@ -741,7 +850,7 @@
         <w:ind w:left="2880" w:hanging="360"/>
       </w:pPr>
       <w:rPr>
-        <w:rFonts w:hint="default" w:ascii="Wingdings" w:hAnsi="Wingdings"/>
+        <w:rFonts w:ascii="Wingdings" w:hAnsi="Wingdings" w:hint="default"/>
         <w:sz w:val="20"/>
       </w:rPr>
     </w:lvl>
@@ -757,7 +866,7 @@
         <w:ind w:left="3600" w:hanging="360"/>
       </w:pPr>
       <w:rPr>
-        <w:rFonts w:hint="default" w:ascii="Wingdings" w:hAnsi="Wingdings"/>
+        <w:rFonts w:ascii="Wingdings" w:hAnsi="Wingdings" w:hint="default"/>
         <w:sz w:val="20"/>
       </w:rPr>
     </w:lvl>
@@ -773,7 +882,7 @@
         <w:ind w:left="4320" w:hanging="360"/>
       </w:pPr>
       <w:rPr>
-        <w:rFonts w:hint="default" w:ascii="Wingdings" w:hAnsi="Wingdings"/>
+        <w:rFonts w:ascii="Wingdings" w:hAnsi="Wingdings" w:hint="default"/>
         <w:sz w:val="20"/>
       </w:rPr>
     </w:lvl>
@@ -789,7 +898,7 @@
         <w:ind w:left="5040" w:hanging="360"/>
       </w:pPr>
       <w:rPr>
-        <w:rFonts w:hint="default" w:ascii="Wingdings" w:hAnsi="Wingdings"/>
+        <w:rFonts w:ascii="Wingdings" w:hAnsi="Wingdings" w:hint="default"/>
         <w:sz w:val="20"/>
       </w:rPr>
     </w:lvl>
@@ -805,7 +914,7 @@
         <w:ind w:left="5760" w:hanging="360"/>
       </w:pPr>
       <w:rPr>
-        <w:rFonts w:hint="default" w:ascii="Wingdings" w:hAnsi="Wingdings"/>
+        <w:rFonts w:ascii="Wingdings" w:hAnsi="Wingdings" w:hint="default"/>
         <w:sz w:val="20"/>
       </w:rPr>
     </w:lvl>
@@ -821,7 +930,7 @@
         <w:ind w:left="6480" w:hanging="360"/>
       </w:pPr>
       <w:rPr>
-        <w:rFonts w:hint="default" w:ascii="Wingdings" w:hAnsi="Wingdings"/>
+        <w:rFonts w:ascii="Wingdings" w:hAnsi="Wingdings" w:hint="default"/>
         <w:sz w:val="20"/>
       </w:rPr>
     </w:lvl>
@@ -839,7 +948,7 @@
         <w:ind w:left="720" w:hanging="360"/>
       </w:pPr>
       <w:rPr>
-        <w:rFonts w:hint="default" w:ascii="Symbol" w:hAnsi="Symbol"/>
+        <w:rFonts w:ascii="Symbol" w:hAnsi="Symbol" w:hint="default"/>
       </w:rPr>
     </w:lvl>
     <w:lvl w:ilvl="1" w:tplc="04130003" w:tentative="1">
@@ -851,7 +960,7 @@
         <w:ind w:left="1440" w:hanging="360"/>
       </w:pPr>
       <w:rPr>
-        <w:rFonts w:hint="default" w:ascii="Courier New" w:hAnsi="Courier New" w:cs="Courier New"/>
+        <w:rFonts w:ascii="Courier New" w:hAnsi="Courier New" w:cs="Courier New" w:hint="default"/>
       </w:rPr>
     </w:lvl>
     <w:lvl w:ilvl="2" w:tplc="04130005" w:tentative="1">
@@ -863,7 +972,7 @@
         <w:ind w:left="2160" w:hanging="360"/>
       </w:pPr>
       <w:rPr>
-        <w:rFonts w:hint="default" w:ascii="Wingdings" w:hAnsi="Wingdings"/>
+        <w:rFonts w:ascii="Wingdings" w:hAnsi="Wingdings" w:hint="default"/>
       </w:rPr>
     </w:lvl>
     <w:lvl w:ilvl="3" w:tplc="04130001" w:tentative="1">
@@ -875,7 +984,7 @@
         <w:ind w:left="2880" w:hanging="360"/>
       </w:pPr>
       <w:rPr>
-        <w:rFonts w:hint="default" w:ascii="Symbol" w:hAnsi="Symbol"/>
+        <w:rFonts w:ascii="Symbol" w:hAnsi="Symbol" w:hint="default"/>
       </w:rPr>
     </w:lvl>
     <w:lvl w:ilvl="4" w:tplc="04130003" w:tentative="1">
@@ -887,7 +996,7 @@
         <w:ind w:left="3600" w:hanging="360"/>
       </w:pPr>
       <w:rPr>
-        <w:rFonts w:hint="default" w:ascii="Courier New" w:hAnsi="Courier New" w:cs="Courier New"/>
+        <w:rFonts w:ascii="Courier New" w:hAnsi="Courier New" w:cs="Courier New" w:hint="default"/>
       </w:rPr>
     </w:lvl>
     <w:lvl w:ilvl="5" w:tplc="04130005" w:tentative="1">
@@ -899,7 +1008,7 @@
         <w:ind w:left="4320" w:hanging="360"/>
       </w:pPr>
       <w:rPr>
-        <w:rFonts w:hint="default" w:ascii="Wingdings" w:hAnsi="Wingdings"/>
+        <w:rFonts w:ascii="Wingdings" w:hAnsi="Wingdings" w:hint="default"/>
       </w:rPr>
     </w:lvl>
     <w:lvl w:ilvl="6" w:tplc="04130001" w:tentative="1">
@@ -911,7 +1020,7 @@
         <w:ind w:left="5040" w:hanging="360"/>
       </w:pPr>
       <w:rPr>
-        <w:rFonts w:hint="default" w:ascii="Symbol" w:hAnsi="Symbol"/>
+        <w:rFonts w:ascii="Symbol" w:hAnsi="Symbol" w:hint="default"/>
       </w:rPr>
     </w:lvl>
     <w:lvl w:ilvl="7" w:tplc="04130003" w:tentative="1">
@@ -923,7 +1032,7 @@
         <w:ind w:left="5760" w:hanging="360"/>
       </w:pPr>
       <w:rPr>
-        <w:rFonts w:hint="default" w:ascii="Courier New" w:hAnsi="Courier New" w:cs="Courier New"/>
+        <w:rFonts w:ascii="Courier New" w:hAnsi="Courier New" w:cs="Courier New" w:hint="default"/>
       </w:rPr>
     </w:lvl>
     <w:lvl w:ilvl="8" w:tplc="04130005" w:tentative="1">
@@ -935,7 +1044,7 @@
         <w:ind w:left="6480" w:hanging="360"/>
       </w:pPr>
       <w:rPr>
-        <w:rFonts w:hint="default" w:ascii="Wingdings" w:hAnsi="Wingdings"/>
+        <w:rFonts w:ascii="Wingdings" w:hAnsi="Wingdings" w:hint="default"/>
       </w:rPr>
     </w:lvl>
   </w:abstractNum>
@@ -955,7 +1064,7 @@
         <w:ind w:left="720" w:hanging="360"/>
       </w:pPr>
       <w:rPr>
-        <w:rFonts w:hint="default" w:ascii="Symbol" w:hAnsi="Symbol"/>
+        <w:rFonts w:ascii="Symbol" w:hAnsi="Symbol" w:hint="default"/>
         <w:sz w:val="20"/>
       </w:rPr>
     </w:lvl>
@@ -971,7 +1080,7 @@
         <w:ind w:left="1440" w:hanging="360"/>
       </w:pPr>
       <w:rPr>
-        <w:rFonts w:hint="default" w:ascii="Courier New" w:hAnsi="Courier New"/>
+        <w:rFonts w:ascii="Courier New" w:hAnsi="Courier New" w:hint="default"/>
         <w:sz w:val="20"/>
       </w:rPr>
     </w:lvl>
@@ -987,7 +1096,7 @@
         <w:ind w:left="2160" w:hanging="360"/>
       </w:pPr>
       <w:rPr>
-        <w:rFonts w:hint="default" w:ascii="Wingdings" w:hAnsi="Wingdings"/>
+        <w:rFonts w:ascii="Wingdings" w:hAnsi="Wingdings" w:hint="default"/>
         <w:sz w:val="20"/>
       </w:rPr>
     </w:lvl>
@@ -1003,7 +1112,7 @@
         <w:ind w:left="2880" w:hanging="360"/>
       </w:pPr>
       <w:rPr>
-        <w:rFonts w:hint="default" w:ascii="Wingdings" w:hAnsi="Wingdings"/>
+        <w:rFonts w:ascii="Wingdings" w:hAnsi="Wingdings" w:hint="default"/>
         <w:sz w:val="20"/>
       </w:rPr>
     </w:lvl>
@@ -1019,7 +1128,7 @@
         <w:ind w:left="3600" w:hanging="360"/>
       </w:pPr>
       <w:rPr>
-        <w:rFonts w:hint="default" w:ascii="Wingdings" w:hAnsi="Wingdings"/>
+        <w:rFonts w:ascii="Wingdings" w:hAnsi="Wingdings" w:hint="default"/>
         <w:sz w:val="20"/>
       </w:rPr>
     </w:lvl>
@@ -1035,7 +1144,7 @@
         <w:ind w:left="4320" w:hanging="360"/>
       </w:pPr>
       <w:rPr>
-        <w:rFonts w:hint="default" w:ascii="Wingdings" w:hAnsi="Wingdings"/>
+        <w:rFonts w:ascii="Wingdings" w:hAnsi="Wingdings" w:hint="default"/>
         <w:sz w:val="20"/>
       </w:rPr>
     </w:lvl>
@@ -1051,7 +1160,7 @@
         <w:ind w:left="5040" w:hanging="360"/>
       </w:pPr>
       <w:rPr>
-        <w:rFonts w:hint="default" w:ascii="Wingdings" w:hAnsi="Wingdings"/>
+        <w:rFonts w:ascii="Wingdings" w:hAnsi="Wingdings" w:hint="default"/>
         <w:sz w:val="20"/>
       </w:rPr>
     </w:lvl>
@@ -1067,7 +1176,7 @@
         <w:ind w:left="5760" w:hanging="360"/>
       </w:pPr>
       <w:rPr>
-        <w:rFonts w:hint="default" w:ascii="Wingdings" w:hAnsi="Wingdings"/>
+        <w:rFonts w:ascii="Wingdings" w:hAnsi="Wingdings" w:hint="default"/>
         <w:sz w:val="20"/>
       </w:rPr>
     </w:lvl>
@@ -1083,7 +1192,7 @@
         <w:ind w:left="6480" w:hanging="360"/>
       </w:pPr>
       <w:rPr>
-        <w:rFonts w:hint="default" w:ascii="Wingdings" w:hAnsi="Wingdings"/>
+        <w:rFonts w:ascii="Wingdings" w:hAnsi="Wingdings" w:hint="default"/>
         <w:sz w:val="20"/>
       </w:rPr>
     </w:lvl>
@@ -1104,7 +1213,7 @@
         <w:ind w:left="720" w:hanging="360"/>
       </w:pPr>
       <w:rPr>
-        <w:rFonts w:hint="default" w:ascii="Symbol" w:hAnsi="Symbol"/>
+        <w:rFonts w:ascii="Symbol" w:hAnsi="Symbol" w:hint="default"/>
         <w:sz w:val="20"/>
       </w:rPr>
     </w:lvl>
@@ -1120,7 +1229,7 @@
         <w:ind w:left="1440" w:hanging="360"/>
       </w:pPr>
       <w:rPr>
-        <w:rFonts w:hint="default" w:ascii="Courier New" w:hAnsi="Courier New"/>
+        <w:rFonts w:ascii="Courier New" w:hAnsi="Courier New" w:hint="default"/>
         <w:sz w:val="20"/>
       </w:rPr>
     </w:lvl>
@@ -1136,7 +1245,7 @@
         <w:ind w:left="2160" w:hanging="360"/>
       </w:pPr>
       <w:rPr>
-        <w:rFonts w:hint="default" w:ascii="Wingdings" w:hAnsi="Wingdings"/>
+        <w:rFonts w:ascii="Wingdings" w:hAnsi="Wingdings" w:hint="default"/>
         <w:sz w:val="20"/>
       </w:rPr>
     </w:lvl>
@@ -1152,7 +1261,7 @@
         <w:ind w:left="2880" w:hanging="360"/>
       </w:pPr>
       <w:rPr>
-        <w:rFonts w:hint="default" w:ascii="Wingdings" w:hAnsi="Wingdings"/>
+        <w:rFonts w:ascii="Wingdings" w:hAnsi="Wingdings" w:hint="default"/>
         <w:sz w:val="20"/>
       </w:rPr>
     </w:lvl>
@@ -1168,7 +1277,7 @@
         <w:ind w:left="3600" w:hanging="360"/>
       </w:pPr>
       <w:rPr>
-        <w:rFonts w:hint="default" w:ascii="Wingdings" w:hAnsi="Wingdings"/>
+        <w:rFonts w:ascii="Wingdings" w:hAnsi="Wingdings" w:hint="default"/>
         <w:sz w:val="20"/>
       </w:rPr>
     </w:lvl>
@@ -1184,7 +1293,7 @@
         <w:ind w:left="4320" w:hanging="360"/>
       </w:pPr>
       <w:rPr>
-        <w:rFonts w:hint="default" w:ascii="Wingdings" w:hAnsi="Wingdings"/>
+        <w:rFonts w:ascii="Wingdings" w:hAnsi="Wingdings" w:hint="default"/>
         <w:sz w:val="20"/>
       </w:rPr>
     </w:lvl>
@@ -1200,7 +1309,7 @@
         <w:ind w:left="5040" w:hanging="360"/>
       </w:pPr>
       <w:rPr>
-        <w:rFonts w:hint="default" w:ascii="Wingdings" w:hAnsi="Wingdings"/>
+        <w:rFonts w:ascii="Wingdings" w:hAnsi="Wingdings" w:hint="default"/>
         <w:sz w:val="20"/>
       </w:rPr>
     </w:lvl>
@@ -1216,7 +1325,7 @@
         <w:ind w:left="5760" w:hanging="360"/>
       </w:pPr>
       <w:rPr>
-        <w:rFonts w:hint="default" w:ascii="Wingdings" w:hAnsi="Wingdings"/>
+        <w:rFonts w:ascii="Wingdings" w:hAnsi="Wingdings" w:hint="default"/>
         <w:sz w:val="20"/>
       </w:rPr>
     </w:lvl>
@@ -1232,7 +1341,7 @@
         <w:ind w:left="6480" w:hanging="360"/>
       </w:pPr>
       <w:rPr>
-        <w:rFonts w:hint="default" w:ascii="Wingdings" w:hAnsi="Wingdings"/>
+        <w:rFonts w:ascii="Wingdings" w:hAnsi="Wingdings" w:hint="default"/>
         <w:sz w:val="20"/>
       </w:rPr>
     </w:lvl>
@@ -1253,7 +1362,7 @@
         <w:ind w:left="720" w:hanging="360"/>
       </w:pPr>
       <w:rPr>
-        <w:rFonts w:hint="default" w:ascii="Symbol" w:hAnsi="Symbol"/>
+        <w:rFonts w:ascii="Symbol" w:hAnsi="Symbol" w:hint="default"/>
         <w:sz w:val="20"/>
       </w:rPr>
     </w:lvl>
@@ -1269,7 +1378,7 @@
         <w:ind w:left="1440" w:hanging="360"/>
       </w:pPr>
       <w:rPr>
-        <w:rFonts w:hint="default" w:ascii="Courier New" w:hAnsi="Courier New"/>
+        <w:rFonts w:ascii="Courier New" w:hAnsi="Courier New" w:hint="default"/>
         <w:sz w:val="20"/>
       </w:rPr>
     </w:lvl>
@@ -1285,7 +1394,7 @@
         <w:ind w:left="2160" w:hanging="360"/>
       </w:pPr>
       <w:rPr>
-        <w:rFonts w:hint="default" w:ascii="Wingdings" w:hAnsi="Wingdings"/>
+        <w:rFonts w:ascii="Wingdings" w:hAnsi="Wingdings" w:hint="default"/>
         <w:sz w:val="20"/>
       </w:rPr>
     </w:lvl>
@@ -1301,7 +1410,7 @@
         <w:ind w:left="2880" w:hanging="360"/>
       </w:pPr>
       <w:rPr>
-        <w:rFonts w:hint="default" w:ascii="Wingdings" w:hAnsi="Wingdings"/>
+        <w:rFonts w:ascii="Wingdings" w:hAnsi="Wingdings" w:hint="default"/>
         <w:sz w:val="20"/>
       </w:rPr>
     </w:lvl>
@@ -1317,7 +1426,7 @@
         <w:ind w:left="3600" w:hanging="360"/>
       </w:pPr>
       <w:rPr>
-        <w:rFonts w:hint="default" w:ascii="Wingdings" w:hAnsi="Wingdings"/>
+        <w:rFonts w:ascii="Wingdings" w:hAnsi="Wingdings" w:hint="default"/>
         <w:sz w:val="20"/>
       </w:rPr>
     </w:lvl>
@@ -1333,7 +1442,7 @@
         <w:ind w:left="4320" w:hanging="360"/>
       </w:pPr>
       <w:rPr>
-        <w:rFonts w:hint="default" w:ascii="Wingdings" w:hAnsi="Wingdings"/>
+        <w:rFonts w:ascii="Wingdings" w:hAnsi="Wingdings" w:hint="default"/>
         <w:sz w:val="20"/>
       </w:rPr>
     </w:lvl>
@@ -1349,7 +1458,7 @@
         <w:ind w:left="5040" w:hanging="360"/>
       </w:pPr>
       <w:rPr>
-        <w:rFonts w:hint="default" w:ascii="Wingdings" w:hAnsi="Wingdings"/>
+        <w:rFonts w:ascii="Wingdings" w:hAnsi="Wingdings" w:hint="default"/>
         <w:sz w:val="20"/>
       </w:rPr>
     </w:lvl>
@@ -1365,7 +1474,7 @@
         <w:ind w:left="5760" w:hanging="360"/>
       </w:pPr>
       <w:rPr>
-        <w:rFonts w:hint="default" w:ascii="Wingdings" w:hAnsi="Wingdings"/>
+        <w:rFonts w:ascii="Wingdings" w:hAnsi="Wingdings" w:hint="default"/>
         <w:sz w:val="20"/>
       </w:rPr>
     </w:lvl>
@@ -1381,7 +1490,7 @@
         <w:ind w:left="6480" w:hanging="360"/>
       </w:pPr>
       <w:rPr>
-        <w:rFonts w:hint="default" w:ascii="Wingdings" w:hAnsi="Wingdings"/>
+        <w:rFonts w:ascii="Wingdings" w:hAnsi="Wingdings" w:hint="default"/>
         <w:sz w:val="20"/>
       </w:rPr>
     </w:lvl>
@@ -1402,7 +1511,7 @@
         <w:ind w:left="720" w:hanging="360"/>
       </w:pPr>
       <w:rPr>
-        <w:rFonts w:hint="default" w:ascii="Symbol" w:hAnsi="Symbol"/>
+        <w:rFonts w:ascii="Symbol" w:hAnsi="Symbol" w:hint="default"/>
         <w:sz w:val="20"/>
       </w:rPr>
     </w:lvl>
@@ -1418,7 +1527,7 @@
         <w:ind w:left="1440" w:hanging="360"/>
       </w:pPr>
       <w:rPr>
-        <w:rFonts w:hint="default" w:ascii="Courier New" w:hAnsi="Courier New"/>
+        <w:rFonts w:ascii="Courier New" w:hAnsi="Courier New" w:hint="default"/>
         <w:sz w:val="20"/>
       </w:rPr>
     </w:lvl>
@@ -1434,7 +1543,7 @@
         <w:ind w:left="2160" w:hanging="360"/>
       </w:pPr>
       <w:rPr>
-        <w:rFonts w:hint="default" w:ascii="Wingdings" w:hAnsi="Wingdings"/>
+        <w:rFonts w:ascii="Wingdings" w:hAnsi="Wingdings" w:hint="default"/>
         <w:sz w:val="20"/>
       </w:rPr>
     </w:lvl>
@@ -1450,7 +1559,7 @@
         <w:ind w:left="2880" w:hanging="360"/>
       </w:pPr>
       <w:rPr>
-        <w:rFonts w:hint="default" w:ascii="Wingdings" w:hAnsi="Wingdings"/>
+        <w:rFonts w:ascii="Wingdings" w:hAnsi="Wingdings" w:hint="default"/>
         <w:sz w:val="20"/>
       </w:rPr>
     </w:lvl>
@@ -1466,7 +1575,7 @@
         <w:ind w:left="3600" w:hanging="360"/>
       </w:pPr>
       <w:rPr>
-        <w:rFonts w:hint="default" w:ascii="Wingdings" w:hAnsi="Wingdings"/>
+        <w:rFonts w:ascii="Wingdings" w:hAnsi="Wingdings" w:hint="default"/>
         <w:sz w:val="20"/>
       </w:rPr>
     </w:lvl>
@@ -1482,7 +1591,7 @@
         <w:ind w:left="4320" w:hanging="360"/>
       </w:pPr>
       <w:rPr>
-        <w:rFonts w:hint="default" w:ascii="Wingdings" w:hAnsi="Wingdings"/>
+        <w:rFonts w:ascii="Wingdings" w:hAnsi="Wingdings" w:hint="default"/>
         <w:sz w:val="20"/>
       </w:rPr>
     </w:lvl>
@@ -1498,7 +1607,7 @@
         <w:ind w:left="5040" w:hanging="360"/>
       </w:pPr>
       <w:rPr>
-        <w:rFonts w:hint="default" w:ascii="Wingdings" w:hAnsi="Wingdings"/>
+        <w:rFonts w:ascii="Wingdings" w:hAnsi="Wingdings" w:hint="default"/>
         <w:sz w:val="20"/>
       </w:rPr>
     </w:lvl>
@@ -1514,7 +1623,7 @@
         <w:ind w:left="5760" w:hanging="360"/>
       </w:pPr>
       <w:rPr>
-        <w:rFonts w:hint="default" w:ascii="Wingdings" w:hAnsi="Wingdings"/>
+        <w:rFonts w:ascii="Wingdings" w:hAnsi="Wingdings" w:hint="default"/>
         <w:sz w:val="20"/>
       </w:rPr>
     </w:lvl>
@@ -1530,7 +1639,7 @@
         <w:ind w:left="6480" w:hanging="360"/>
       </w:pPr>
       <w:rPr>
-        <w:rFonts w:hint="default" w:ascii="Wingdings" w:hAnsi="Wingdings"/>
+        <w:rFonts w:ascii="Wingdings" w:hAnsi="Wingdings" w:hint="default"/>
         <w:sz w:val="20"/>
       </w:rPr>
     </w:lvl>
@@ -1753,7 +1862,7 @@
         <w:ind w:left="720" w:hanging="360"/>
       </w:pPr>
       <w:rPr>
-        <w:rFonts w:hint="default" w:ascii="Symbol" w:hAnsi="Symbol"/>
+        <w:rFonts w:ascii="Symbol" w:hAnsi="Symbol" w:hint="default"/>
         <w:sz w:val="20"/>
       </w:rPr>
     </w:lvl>
@@ -1769,7 +1878,7 @@
         <w:ind w:left="1440" w:hanging="360"/>
       </w:pPr>
       <w:rPr>
-        <w:rFonts w:hint="default" w:ascii="Courier New" w:hAnsi="Courier New"/>
+        <w:rFonts w:ascii="Courier New" w:hAnsi="Courier New" w:hint="default"/>
         <w:sz w:val="20"/>
       </w:rPr>
     </w:lvl>
@@ -1785,7 +1894,7 @@
         <w:ind w:left="2160" w:hanging="360"/>
       </w:pPr>
       <w:rPr>
-        <w:rFonts w:hint="default" w:ascii="Wingdings" w:hAnsi="Wingdings"/>
+        <w:rFonts w:ascii="Wingdings" w:hAnsi="Wingdings" w:hint="default"/>
         <w:sz w:val="20"/>
       </w:rPr>
     </w:lvl>
@@ -1801,7 +1910,7 @@
         <w:ind w:left="2880" w:hanging="360"/>
       </w:pPr>
       <w:rPr>
-        <w:rFonts w:hint="default" w:ascii="Wingdings" w:hAnsi="Wingdings"/>
+        <w:rFonts w:ascii="Wingdings" w:hAnsi="Wingdings" w:hint="default"/>
         <w:sz w:val="20"/>
       </w:rPr>
     </w:lvl>
@@ -1817,7 +1926,7 @@
         <w:ind w:left="3600" w:hanging="360"/>
       </w:pPr>
       <w:rPr>
-        <w:rFonts w:hint="default" w:ascii="Wingdings" w:hAnsi="Wingdings"/>
+        <w:rFonts w:ascii="Wingdings" w:hAnsi="Wingdings" w:hint="default"/>
         <w:sz w:val="20"/>
       </w:rPr>
     </w:lvl>
@@ -1833,7 +1942,7 @@
         <w:ind w:left="4320" w:hanging="360"/>
       </w:pPr>
       <w:rPr>
-        <w:rFonts w:hint="default" w:ascii="Wingdings" w:hAnsi="Wingdings"/>
+        <w:rFonts w:ascii="Wingdings" w:hAnsi="Wingdings" w:hint="default"/>
         <w:sz w:val="20"/>
       </w:rPr>
     </w:lvl>
@@ -1849,7 +1958,7 @@
         <w:ind w:left="5040" w:hanging="360"/>
       </w:pPr>
       <w:rPr>
-        <w:rFonts w:hint="default" w:ascii="Wingdings" w:hAnsi="Wingdings"/>
+        <w:rFonts w:ascii="Wingdings" w:hAnsi="Wingdings" w:hint="default"/>
         <w:sz w:val="20"/>
       </w:rPr>
     </w:lvl>
@@ -1865,7 +1974,7 @@
         <w:ind w:left="5760" w:hanging="360"/>
       </w:pPr>
       <w:rPr>
-        <w:rFonts w:hint="default" w:ascii="Wingdings" w:hAnsi="Wingdings"/>
+        <w:rFonts w:ascii="Wingdings" w:hAnsi="Wingdings" w:hint="default"/>
         <w:sz w:val="20"/>
       </w:rPr>
     </w:lvl>
@@ -1881,7 +1990,7 @@
         <w:ind w:left="6480" w:hanging="360"/>
       </w:pPr>
       <w:rPr>
-        <w:rFonts w:hint="default" w:ascii="Wingdings" w:hAnsi="Wingdings"/>
+        <w:rFonts w:ascii="Wingdings" w:hAnsi="Wingdings" w:hint="default"/>
         <w:sz w:val="20"/>
       </w:rPr>
     </w:lvl>
@@ -1902,7 +2011,7 @@
         <w:ind w:left="720" w:hanging="360"/>
       </w:pPr>
       <w:rPr>
-        <w:rFonts w:hint="default" w:ascii="Symbol" w:hAnsi="Symbol"/>
+        <w:rFonts w:ascii="Symbol" w:hAnsi="Symbol" w:hint="default"/>
         <w:sz w:val="20"/>
       </w:rPr>
     </w:lvl>
@@ -1935,7 +2044,7 @@
         <w:ind w:left="2160" w:hanging="360"/>
       </w:pPr>
       <w:rPr>
-        <w:rFonts w:hint="default" w:ascii="Wingdings" w:hAnsi="Wingdings"/>
+        <w:rFonts w:ascii="Wingdings" w:hAnsi="Wingdings" w:hint="default"/>
         <w:sz w:val="20"/>
       </w:rPr>
     </w:lvl>
@@ -1951,7 +2060,7 @@
         <w:ind w:left="2880" w:hanging="360"/>
       </w:pPr>
       <w:rPr>
-        <w:rFonts w:hint="default" w:ascii="Wingdings" w:hAnsi="Wingdings"/>
+        <w:rFonts w:ascii="Wingdings" w:hAnsi="Wingdings" w:hint="default"/>
         <w:sz w:val="20"/>
       </w:rPr>
     </w:lvl>
@@ -1967,7 +2076,7 @@
         <w:ind w:left="3600" w:hanging="360"/>
       </w:pPr>
       <w:rPr>
-        <w:rFonts w:hint="default" w:ascii="Wingdings" w:hAnsi="Wingdings"/>
+        <w:rFonts w:ascii="Wingdings" w:hAnsi="Wingdings" w:hint="default"/>
         <w:sz w:val="20"/>
       </w:rPr>
     </w:lvl>
@@ -1983,7 +2092,7 @@
         <w:ind w:left="4320" w:hanging="360"/>
       </w:pPr>
       <w:rPr>
-        <w:rFonts w:hint="default" w:ascii="Wingdings" w:hAnsi="Wingdings"/>
+        <w:rFonts w:ascii="Wingdings" w:hAnsi="Wingdings" w:hint="default"/>
         <w:sz w:val="20"/>
       </w:rPr>
     </w:lvl>
@@ -1999,7 +2108,7 @@
         <w:ind w:left="5040" w:hanging="360"/>
       </w:pPr>
       <w:rPr>
-        <w:rFonts w:hint="default" w:ascii="Wingdings" w:hAnsi="Wingdings"/>
+        <w:rFonts w:ascii="Wingdings" w:hAnsi="Wingdings" w:hint="default"/>
         <w:sz w:val="20"/>
       </w:rPr>
     </w:lvl>
@@ -2015,7 +2124,7 @@
         <w:ind w:left="5760" w:hanging="360"/>
       </w:pPr>
       <w:rPr>
-        <w:rFonts w:hint="default" w:ascii="Wingdings" w:hAnsi="Wingdings"/>
+        <w:rFonts w:ascii="Wingdings" w:hAnsi="Wingdings" w:hint="default"/>
         <w:sz w:val="20"/>
       </w:rPr>
     </w:lvl>
@@ -2031,7 +2140,7 @@
         <w:ind w:left="6480" w:hanging="360"/>
       </w:pPr>
       <w:rPr>
-        <w:rFonts w:hint="default" w:ascii="Wingdings" w:hAnsi="Wingdings"/>
+        <w:rFonts w:ascii="Wingdings" w:hAnsi="Wingdings" w:hint="default"/>
         <w:sz w:val="20"/>
       </w:rPr>
     </w:lvl>
@@ -2052,7 +2161,7 @@
         <w:ind w:left="720" w:hanging="360"/>
       </w:pPr>
       <w:rPr>
-        <w:rFonts w:hint="default" w:ascii="Symbol" w:hAnsi="Symbol"/>
+        <w:rFonts w:ascii="Symbol" w:hAnsi="Symbol" w:hint="default"/>
         <w:sz w:val="20"/>
       </w:rPr>
     </w:lvl>
@@ -2068,7 +2177,7 @@
         <w:ind w:left="1440" w:hanging="360"/>
       </w:pPr>
       <w:rPr>
-        <w:rFonts w:hint="default" w:ascii="Courier New" w:hAnsi="Courier New"/>
+        <w:rFonts w:ascii="Courier New" w:hAnsi="Courier New" w:hint="default"/>
         <w:sz w:val="20"/>
       </w:rPr>
     </w:lvl>
@@ -2084,7 +2193,7 @@
         <w:ind w:left="2160" w:hanging="360"/>
       </w:pPr>
       <w:rPr>
-        <w:rFonts w:hint="default" w:ascii="Wingdings" w:hAnsi="Wingdings"/>
+        <w:rFonts w:ascii="Wingdings" w:hAnsi="Wingdings" w:hint="default"/>
         <w:sz w:val="20"/>
       </w:rPr>
     </w:lvl>
@@ -2100,7 +2209,7 @@
         <w:ind w:left="2880" w:hanging="360"/>
       </w:pPr>
       <w:rPr>
-        <w:rFonts w:hint="default" w:ascii="Wingdings" w:hAnsi="Wingdings"/>
+        <w:rFonts w:ascii="Wingdings" w:hAnsi="Wingdings" w:hint="default"/>
         <w:sz w:val="20"/>
       </w:rPr>
     </w:lvl>
@@ -2116,7 +2225,7 @@
         <w:ind w:left="3600" w:hanging="360"/>
       </w:pPr>
       <w:rPr>
-        <w:rFonts w:hint="default" w:ascii="Wingdings" w:hAnsi="Wingdings"/>
+        <w:rFonts w:ascii="Wingdings" w:hAnsi="Wingdings" w:hint="default"/>
         <w:sz w:val="20"/>
       </w:rPr>
     </w:lvl>
@@ -2132,7 +2241,7 @@
         <w:ind w:left="4320" w:hanging="360"/>
       </w:pPr>
       <w:rPr>
-        <w:rFonts w:hint="default" w:ascii="Wingdings" w:hAnsi="Wingdings"/>
+        <w:rFonts w:ascii="Wingdings" w:hAnsi="Wingdings" w:hint="default"/>
         <w:sz w:val="20"/>
       </w:rPr>
     </w:lvl>
@@ -2148,7 +2257,7 @@
         <w:ind w:left="5040" w:hanging="360"/>
       </w:pPr>
       <w:rPr>
-        <w:rFonts w:hint="default" w:ascii="Wingdings" w:hAnsi="Wingdings"/>
+        <w:rFonts w:ascii="Wingdings" w:hAnsi="Wingdings" w:hint="default"/>
         <w:sz w:val="20"/>
       </w:rPr>
     </w:lvl>
@@ -2164,7 +2273,7 @@
         <w:ind w:left="5760" w:hanging="360"/>
       </w:pPr>
       <w:rPr>
-        <w:rFonts w:hint="default" w:ascii="Wingdings" w:hAnsi="Wingdings"/>
+        <w:rFonts w:ascii="Wingdings" w:hAnsi="Wingdings" w:hint="default"/>
         <w:sz w:val="20"/>
       </w:rPr>
     </w:lvl>
@@ -2180,7 +2289,7 @@
         <w:ind w:left="6480" w:hanging="360"/>
       </w:pPr>
       <w:rPr>
-        <w:rFonts w:hint="default" w:ascii="Wingdings" w:hAnsi="Wingdings"/>
+        <w:rFonts w:ascii="Wingdings" w:hAnsi="Wingdings" w:hint="default"/>
         <w:sz w:val="20"/>
       </w:rPr>
     </w:lvl>
@@ -2338,11 +2447,11 @@
 </file>
 
 <file path=word/styles.xml><?xml version="1.0" encoding="utf-8"?>
-<w:styles xmlns:wp14="http://schemas.microsoft.com/office/word/2010/wordprocessingDrawing" xmlns:mc="http://schemas.openxmlformats.org/markup-compatibility/2006" xmlns:r="http://schemas.openxmlformats.org/officeDocument/2006/relationships" xmlns:w="http://schemas.openxmlformats.org/wordprocessingml/2006/main" xmlns:w14="http://schemas.microsoft.com/office/word/2010/wordml" xmlns:w15="http://schemas.microsoft.com/office/word/2012/wordml" xmlns:w16cex="http://schemas.microsoft.com/office/word/2018/wordml/cex" xmlns:w16cid="http://schemas.microsoft.com/office/word/2016/wordml/cid" xmlns:w16="http://schemas.microsoft.com/office/word/2018/wordml" xmlns:w16du="http://schemas.microsoft.com/office/word/2023/wordml/word16du" xmlns:w16sdtdh="http://schemas.microsoft.com/office/word/2020/wordml/sdtdatahash" xmlns:w16sdtfl="http://schemas.microsoft.com/office/word/2024/wordml/sdtformatlock" xmlns:w16se="http://schemas.microsoft.com/office/word/2015/wordml/symex" mc:Ignorable="w14 w15 w16se w16cid w16 w16cex w16sdtdh w16sdtfl w16du wp14">
+<w:styles xmlns:mc="http://schemas.openxmlformats.org/markup-compatibility/2006" xmlns:r="http://schemas.openxmlformats.org/officeDocument/2006/relationships" xmlns:w="http://schemas.openxmlformats.org/wordprocessingml/2006/main" xmlns:w14="http://schemas.microsoft.com/office/word/2010/wordml" xmlns:w15="http://schemas.microsoft.com/office/word/2012/wordml" xmlns:w16cex="http://schemas.microsoft.com/office/word/2018/wordml/cex" xmlns:w16cid="http://schemas.microsoft.com/office/word/2016/wordml/cid" xmlns:w16="http://schemas.microsoft.com/office/word/2018/wordml" xmlns:w16du="http://schemas.microsoft.com/office/word/2023/wordml/word16du" xmlns:w16sdtdh="http://schemas.microsoft.com/office/word/2020/wordml/sdtdatahash" xmlns:w16sdtfl="http://schemas.microsoft.com/office/word/2024/wordml/sdtformatlock" xmlns:w16se="http://schemas.microsoft.com/office/word/2015/wordml/symex" mc:Ignorable="w14 w15 w16se w16cid w16 w16cex w16sdtdh w16sdtfl w16du">
   <w:docDefaults>
     <w:rPrDefault>
       <w:rPr>
-        <w:rFonts w:asciiTheme="minorHAnsi" w:hAnsiTheme="minorHAnsi" w:eastAsiaTheme="minorHAnsi" w:cstheme="minorBidi"/>
+        <w:rFonts w:asciiTheme="minorHAnsi" w:eastAsiaTheme="minorHAnsi" w:hAnsiTheme="minorHAnsi" w:cstheme="minorBidi"/>
         <w:kern w:val="2"/>
         <w:sz w:val="24"/>
         <w:szCs w:val="24"/>
@@ -2359,14 +2468,14 @@
   <w:latentStyles w:defLockedState="0" w:defUIPriority="99" w:defSemiHidden="0" w:defUnhideWhenUsed="0" w:defQFormat="0" w:count="376">
     <w:lsdException w:name="Normal" w:uiPriority="0" w:qFormat="1"/>
     <w:lsdException w:name="heading 1" w:uiPriority="0" w:qFormat="1"/>
-    <w:lsdException w:name="heading 2" w:uiPriority="9" w:semiHidden="1" w:unhideWhenUsed="1" w:qFormat="1"/>
-    <w:lsdException w:name="heading 3" w:uiPriority="9" w:semiHidden="1" w:unhideWhenUsed="1" w:qFormat="1"/>
-    <w:lsdException w:name="heading 4" w:uiPriority="9" w:semiHidden="1" w:unhideWhenUsed="1" w:qFormat="1"/>
-    <w:lsdException w:name="heading 5" w:uiPriority="9" w:semiHidden="1" w:unhideWhenUsed="1" w:qFormat="1"/>
-    <w:lsdException w:name="heading 6" w:uiPriority="9" w:semiHidden="1" w:unhideWhenUsed="1" w:qFormat="1"/>
-    <w:lsdException w:name="heading 7" w:uiPriority="9" w:semiHidden="1" w:unhideWhenUsed="1" w:qFormat="1"/>
-    <w:lsdException w:name="heading 8" w:uiPriority="9" w:semiHidden="1" w:unhideWhenUsed="1" w:qFormat="1"/>
-    <w:lsdException w:name="heading 9" w:uiPriority="9" w:semiHidden="1" w:unhideWhenUsed="1" w:qFormat="1"/>
+    <w:lsdException w:name="heading 2" w:semiHidden="1" w:uiPriority="9" w:unhideWhenUsed="1" w:qFormat="1"/>
+    <w:lsdException w:name="heading 3" w:semiHidden="1" w:uiPriority="9" w:unhideWhenUsed="1" w:qFormat="1"/>
+    <w:lsdException w:name="heading 4" w:semiHidden="1" w:uiPriority="9" w:unhideWhenUsed="1" w:qFormat="1"/>
+    <w:lsdException w:name="heading 5" w:semiHidden="1" w:uiPriority="9" w:unhideWhenUsed="1" w:qFormat="1"/>
+    <w:lsdException w:name="heading 6" w:semiHidden="1" w:uiPriority="9" w:unhideWhenUsed="1" w:qFormat="1"/>
+    <w:lsdException w:name="heading 7" w:semiHidden="1" w:uiPriority="9" w:unhideWhenUsed="1" w:qFormat="1"/>
+    <w:lsdException w:name="heading 8" w:semiHidden="1" w:uiPriority="9" w:unhideWhenUsed="1" w:qFormat="1"/>
+    <w:lsdException w:name="heading 9" w:semiHidden="1" w:uiPriority="9" w:unhideWhenUsed="1" w:qFormat="1"/>
     <w:lsdException w:name="index 1" w:semiHidden="1" w:unhideWhenUsed="1"/>
     <w:lsdException w:name="index 2" w:semiHidden="1" w:unhideWhenUsed="1"/>
     <w:lsdException w:name="index 3" w:semiHidden="1" w:unhideWhenUsed="1"/>
@@ -2376,22 +2485,22 @@
     <w:lsdException w:name="index 7" w:semiHidden="1" w:unhideWhenUsed="1"/>
     <w:lsdException w:name="index 8" w:semiHidden="1" w:unhideWhenUsed="1"/>
     <w:lsdException w:name="index 9" w:semiHidden="1" w:unhideWhenUsed="1"/>
-    <w:lsdException w:name="toc 1" w:uiPriority="39" w:semiHidden="1" w:unhideWhenUsed="1"/>
-    <w:lsdException w:name="toc 2" w:uiPriority="39" w:semiHidden="1" w:unhideWhenUsed="1"/>
-    <w:lsdException w:name="toc 3" w:uiPriority="39" w:semiHidden="1" w:unhideWhenUsed="1"/>
-    <w:lsdException w:name="toc 4" w:uiPriority="39" w:semiHidden="1" w:unhideWhenUsed="1"/>
-    <w:lsdException w:name="toc 5" w:uiPriority="39" w:semiHidden="1" w:unhideWhenUsed="1"/>
-    <w:lsdException w:name="toc 6" w:uiPriority="39" w:semiHidden="1" w:unhideWhenUsed="1"/>
-    <w:lsdException w:name="toc 7" w:uiPriority="39" w:semiHidden="1" w:unhideWhenUsed="1"/>
-    <w:lsdException w:name="toc 8" w:uiPriority="39" w:semiHidden="1" w:unhideWhenUsed="1"/>
-    <w:lsdException w:name="toc 9" w:uiPriority="39" w:semiHidden="1" w:unhideWhenUsed="1"/>
+    <w:lsdException w:name="toc 1" w:semiHidden="1" w:uiPriority="39" w:unhideWhenUsed="1"/>
+    <w:lsdException w:name="toc 2" w:semiHidden="1" w:uiPriority="39" w:unhideWhenUsed="1"/>
+    <w:lsdException w:name="toc 3" w:semiHidden="1" w:uiPriority="39" w:unhideWhenUsed="1"/>
+    <w:lsdException w:name="toc 4" w:semiHidden="1" w:uiPriority="39" w:unhideWhenUsed="1"/>
+    <w:lsdException w:name="toc 5" w:semiHidden="1" w:uiPriority="39" w:unhideWhenUsed="1"/>
+    <w:lsdException w:name="toc 6" w:semiHidden="1" w:uiPriority="39" w:unhideWhenUsed="1"/>
+    <w:lsdException w:name="toc 7" w:semiHidden="1" w:uiPriority="39" w:unhideWhenUsed="1"/>
+    <w:lsdException w:name="toc 8" w:semiHidden="1" w:uiPriority="39" w:unhideWhenUsed="1"/>
+    <w:lsdException w:name="toc 9" w:semiHidden="1" w:uiPriority="39" w:unhideWhenUsed="1"/>
     <w:lsdException w:name="Normal Indent" w:semiHidden="1" w:unhideWhenUsed="1"/>
     <w:lsdException w:name="footnote text" w:semiHidden="1" w:unhideWhenUsed="1"/>
     <w:lsdException w:name="annotation text" w:semiHidden="1" w:unhideWhenUsed="1"/>
     <w:lsdException w:name="header" w:semiHidden="1" w:unhideWhenUsed="1"/>
     <w:lsdException w:name="footer" w:semiHidden="1" w:unhideWhenUsed="1"/>
     <w:lsdException w:name="index heading" w:semiHidden="1" w:unhideWhenUsed="1"/>
-    <w:lsdException w:name="caption" w:uiPriority="35" w:semiHidden="1" w:unhideWhenUsed="1" w:qFormat="1"/>
+    <w:lsdException w:name="caption" w:semiHidden="1" w:uiPriority="35" w:unhideWhenUsed="1" w:qFormat="1"/>
     <w:lsdException w:name="table of figures" w:semiHidden="1" w:unhideWhenUsed="1"/>
     <w:lsdException w:name="envelope address" w:semiHidden="1" w:unhideWhenUsed="1"/>
     <w:lsdException w:name="envelope return" w:semiHidden="1" w:unhideWhenUsed="1"/>
@@ -2422,7 +2531,7 @@
     <w:lsdException w:name="Title" w:uiPriority="10" w:qFormat="1"/>
     <w:lsdException w:name="Closing" w:semiHidden="1" w:unhideWhenUsed="1"/>
     <w:lsdException w:name="Signature" w:semiHidden="1" w:unhideWhenUsed="1"/>
-    <w:lsdException w:name="Default Paragraph Font" w:uiPriority="1" w:semiHidden="1" w:unhideWhenUsed="1"/>
+    <w:lsdException w:name="Default Paragraph Font" w:semiHidden="1" w:uiPriority="1" w:unhideWhenUsed="1"/>
     <w:lsdException w:name="Body Text" w:semiHidden="1" w:unhideWhenUsed="1"/>
     <w:lsdException w:name="Body Text Indent" w:semiHidden="1" w:unhideWhenUsed="1"/>
     <w:lsdException w:name="List Continue" w:semiHidden="1" w:unhideWhenUsed="1"/>
@@ -2622,8 +2731,8 @@
     <w:lsdException w:name="Subtle Reference" w:uiPriority="31" w:qFormat="1"/>
     <w:lsdException w:name="Intense Reference" w:uiPriority="32" w:qFormat="1"/>
     <w:lsdException w:name="Book Title" w:uiPriority="33" w:qFormat="1"/>
-    <w:lsdException w:name="Bibliography" w:uiPriority="37" w:semiHidden="1" w:unhideWhenUsed="1"/>
-    <w:lsdException w:name="TOC Heading" w:uiPriority="39" w:semiHidden="1" w:unhideWhenUsed="1" w:qFormat="1"/>
+    <w:lsdException w:name="Bibliography" w:semiHidden="1" w:uiPriority="37" w:unhideWhenUsed="1"/>
+    <w:lsdException w:name="TOC Heading" w:semiHidden="1" w:uiPriority="39" w:unhideWhenUsed="1" w:qFormat="1"/>
     <w:lsdException w:name="Plain Table 1" w:uiPriority="41"/>
     <w:lsdException w:name="Plain Table 2" w:uiPriority="42"/>
     <w:lsdException w:name="Plain Table 3" w:uiPriority="43"/>
@@ -2734,7 +2843,7 @@
     <w:lsdException w:name="Unresolved Mention" w:semiHidden="1" w:unhideWhenUsed="1"/>
     <w:lsdException w:name="Smart Link" w:semiHidden="1" w:unhideWhenUsed="1"/>
   </w:latentStyles>
-  <w:style w:type="paragraph" w:styleId="Normal" w:default="1">
+  <w:style w:type="paragraph" w:default="1" w:styleId="Standaard">
     <w:name w:val="Normal"/>
     <w:qFormat/>
     <w:rsid w:val="00C22F06"/>
@@ -2742,16 +2851,16 @@
       <w:spacing w:line="259" w:lineRule="auto"/>
     </w:pPr>
     <w:rPr>
-      <w:rFonts w:ascii="Arial" w:hAnsi="Arial" w:eastAsia="Arial" w:cs="Arial"/>
+      <w:rFonts w:ascii="Arial" w:eastAsia="Arial" w:hAnsi="Arial" w:cs="Arial"/>
       <w:sz w:val="22"/>
       <w:szCs w:val="22"/>
     </w:rPr>
   </w:style>
-  <w:style w:type="paragraph" w:styleId="Heading1">
+  <w:style w:type="paragraph" w:styleId="Kop1">
     <w:name w:val="heading 1"/>
-    <w:basedOn w:val="Normal"/>
-    <w:next w:val="Normal"/>
-    <w:link w:val="Heading1Char"/>
+    <w:basedOn w:val="Standaard"/>
+    <w:next w:val="Standaard"/>
+    <w:link w:val="Kop1Char"/>
     <w:qFormat/>
     <w:rsid w:val="003539DF"/>
     <w:pPr>
@@ -2761,17 +2870,17 @@
       <w:outlineLvl w:val="0"/>
     </w:pPr>
     <w:rPr>
-      <w:rFonts w:asciiTheme="majorHAnsi" w:hAnsiTheme="majorHAnsi" w:eastAsiaTheme="majorEastAsia" w:cstheme="majorBidi"/>
+      <w:rFonts w:asciiTheme="majorHAnsi" w:eastAsiaTheme="majorEastAsia" w:hAnsiTheme="majorHAnsi" w:cstheme="majorBidi"/>
       <w:color w:val="0F4761" w:themeColor="accent1" w:themeShade="BF"/>
       <w:sz w:val="40"/>
       <w:szCs w:val="40"/>
     </w:rPr>
   </w:style>
-  <w:style w:type="paragraph" w:styleId="Heading2">
+  <w:style w:type="paragraph" w:styleId="Kop2">
     <w:name w:val="heading 2"/>
-    <w:basedOn w:val="Normal"/>
-    <w:next w:val="Normal"/>
-    <w:link w:val="Heading2Char"/>
+    <w:basedOn w:val="Standaard"/>
+    <w:next w:val="Standaard"/>
+    <w:link w:val="Kop2Char"/>
     <w:uiPriority w:val="9"/>
     <w:unhideWhenUsed/>
     <w:qFormat/>
@@ -2783,17 +2892,17 @@
       <w:outlineLvl w:val="1"/>
     </w:pPr>
     <w:rPr>
-      <w:rFonts w:asciiTheme="majorHAnsi" w:hAnsiTheme="majorHAnsi" w:eastAsiaTheme="majorEastAsia" w:cstheme="majorBidi"/>
+      <w:rFonts w:asciiTheme="majorHAnsi" w:eastAsiaTheme="majorEastAsia" w:hAnsiTheme="majorHAnsi" w:cstheme="majorBidi"/>
       <w:color w:val="0F4761" w:themeColor="accent1" w:themeShade="BF"/>
       <w:sz w:val="32"/>
       <w:szCs w:val="32"/>
     </w:rPr>
   </w:style>
-  <w:style w:type="paragraph" w:styleId="Heading3">
+  <w:style w:type="paragraph" w:styleId="Kop3">
     <w:name w:val="heading 3"/>
-    <w:basedOn w:val="Normal"/>
-    <w:next w:val="Normal"/>
-    <w:link w:val="Heading3Char"/>
+    <w:basedOn w:val="Standaard"/>
+    <w:next w:val="Standaard"/>
+    <w:link w:val="Kop3Char"/>
     <w:uiPriority w:val="9"/>
     <w:semiHidden/>
     <w:unhideWhenUsed/>
@@ -2812,11 +2921,11 @@
       <w:szCs w:val="28"/>
     </w:rPr>
   </w:style>
-  <w:style w:type="paragraph" w:styleId="Heading4">
+  <w:style w:type="paragraph" w:styleId="Kop4">
     <w:name w:val="heading 4"/>
-    <w:basedOn w:val="Normal"/>
-    <w:next w:val="Normal"/>
-    <w:link w:val="Heading4Char"/>
+    <w:basedOn w:val="Standaard"/>
+    <w:next w:val="Standaard"/>
+    <w:link w:val="Kop4Char"/>
     <w:uiPriority w:val="9"/>
     <w:semiHidden/>
     <w:unhideWhenUsed/>
@@ -2835,11 +2944,11 @@
       <w:color w:val="0F4761" w:themeColor="accent1" w:themeShade="BF"/>
     </w:rPr>
   </w:style>
-  <w:style w:type="paragraph" w:styleId="Heading5">
+  <w:style w:type="paragraph" w:styleId="Kop5">
     <w:name w:val="heading 5"/>
-    <w:basedOn w:val="Normal"/>
-    <w:next w:val="Normal"/>
-    <w:link w:val="Heading5Char"/>
+    <w:basedOn w:val="Standaard"/>
+    <w:next w:val="Standaard"/>
+    <w:link w:val="Kop5Char"/>
     <w:uiPriority w:val="9"/>
     <w:semiHidden/>
     <w:unhideWhenUsed/>
@@ -2856,11 +2965,11 @@
       <w:color w:val="0F4761" w:themeColor="accent1" w:themeShade="BF"/>
     </w:rPr>
   </w:style>
-  <w:style w:type="paragraph" w:styleId="Heading6">
+  <w:style w:type="paragraph" w:styleId="Kop6">
     <w:name w:val="heading 6"/>
-    <w:basedOn w:val="Normal"/>
-    <w:next w:val="Normal"/>
-    <w:link w:val="Heading6Char"/>
+    <w:basedOn w:val="Standaard"/>
+    <w:next w:val="Standaard"/>
+    <w:link w:val="Kop6Char"/>
     <w:uiPriority w:val="9"/>
     <w:semiHidden/>
     <w:unhideWhenUsed/>
@@ -2879,11 +2988,11 @@
       <w:color w:val="595959" w:themeColor="text1" w:themeTint="A6"/>
     </w:rPr>
   </w:style>
-  <w:style w:type="paragraph" w:styleId="Heading7">
+  <w:style w:type="paragraph" w:styleId="Kop7">
     <w:name w:val="heading 7"/>
-    <w:basedOn w:val="Normal"/>
-    <w:next w:val="Normal"/>
-    <w:link w:val="Heading7Char"/>
+    <w:basedOn w:val="Standaard"/>
+    <w:next w:val="Standaard"/>
+    <w:link w:val="Kop7Char"/>
     <w:uiPriority w:val="9"/>
     <w:semiHidden/>
     <w:unhideWhenUsed/>
@@ -2900,11 +3009,11 @@
       <w:color w:val="595959" w:themeColor="text1" w:themeTint="A6"/>
     </w:rPr>
   </w:style>
-  <w:style w:type="paragraph" w:styleId="Heading8">
+  <w:style w:type="paragraph" w:styleId="Kop8">
     <w:name w:val="heading 8"/>
-    <w:basedOn w:val="Normal"/>
-    <w:next w:val="Normal"/>
-    <w:link w:val="Heading8Char"/>
+    <w:basedOn w:val="Standaard"/>
+    <w:next w:val="Standaard"/>
+    <w:link w:val="Kop8Char"/>
     <w:uiPriority w:val="9"/>
     <w:semiHidden/>
     <w:unhideWhenUsed/>
@@ -2923,11 +3032,11 @@
       <w:color w:val="272727" w:themeColor="text1" w:themeTint="D8"/>
     </w:rPr>
   </w:style>
-  <w:style w:type="paragraph" w:styleId="Heading9">
+  <w:style w:type="paragraph" w:styleId="Kop9">
     <w:name w:val="heading 9"/>
-    <w:basedOn w:val="Normal"/>
-    <w:next w:val="Normal"/>
-    <w:link w:val="Heading9Char"/>
+    <w:basedOn w:val="Standaard"/>
+    <w:next w:val="Standaard"/>
+    <w:link w:val="Kop9Char"/>
     <w:uiPriority w:val="9"/>
     <w:semiHidden/>
     <w:unhideWhenUsed/>
@@ -2944,13 +3053,13 @@
       <w:color w:val="272727" w:themeColor="text1" w:themeTint="D8"/>
     </w:rPr>
   </w:style>
-  <w:style w:type="character" w:styleId="DefaultParagraphFont" w:default="1">
+  <w:style w:type="character" w:default="1" w:styleId="Standaardalinea-lettertype">
     <w:name w:val="Default Paragraph Font"/>
     <w:uiPriority w:val="1"/>
     <w:semiHidden/>
     <w:unhideWhenUsed/>
   </w:style>
-  <w:style w:type="table" w:styleId="TableNormal" w:default="1">
+  <w:style w:type="table" w:default="1" w:styleId="Standaardtabel">
     <w:name w:val="Normal Table"/>
     <w:uiPriority w:val="99"/>
     <w:semiHidden/>
@@ -2965,41 +3074,41 @@
       </w:tblCellMar>
     </w:tblPr>
   </w:style>
-  <w:style w:type="numbering" w:styleId="NoList" w:default="1">
+  <w:style w:type="numbering" w:default="1" w:styleId="Geenlijst">
     <w:name w:val="No List"/>
     <w:uiPriority w:val="99"/>
     <w:semiHidden/>
     <w:unhideWhenUsed/>
   </w:style>
-  <w:style w:type="character" w:styleId="Heading1Char" w:customStyle="1">
-    <w:name w:val="Heading 1 Char"/>
-    <w:basedOn w:val="DefaultParagraphFont"/>
-    <w:link w:val="Heading1"/>
+  <w:style w:type="character" w:customStyle="1" w:styleId="Kop1Char">
+    <w:name w:val="Kop 1 Char"/>
+    <w:basedOn w:val="Standaardalinea-lettertype"/>
+    <w:link w:val="Kop1"/>
     <w:rsid w:val="003539DF"/>
     <w:rPr>
-      <w:rFonts w:asciiTheme="majorHAnsi" w:hAnsiTheme="majorHAnsi" w:eastAsiaTheme="majorEastAsia" w:cstheme="majorBidi"/>
+      <w:rFonts w:asciiTheme="majorHAnsi" w:eastAsiaTheme="majorEastAsia" w:hAnsiTheme="majorHAnsi" w:cstheme="majorBidi"/>
       <w:color w:val="0F4761" w:themeColor="accent1" w:themeShade="BF"/>
       <w:sz w:val="40"/>
       <w:szCs w:val="40"/>
     </w:rPr>
   </w:style>
-  <w:style w:type="character" w:styleId="Heading2Char" w:customStyle="1">
-    <w:name w:val="Heading 2 Char"/>
-    <w:basedOn w:val="DefaultParagraphFont"/>
-    <w:link w:val="Heading2"/>
+  <w:style w:type="character" w:customStyle="1" w:styleId="Kop2Char">
+    <w:name w:val="Kop 2 Char"/>
+    <w:basedOn w:val="Standaardalinea-lettertype"/>
+    <w:link w:val="Kop2"/>
     <w:uiPriority w:val="9"/>
     <w:rsid w:val="003539DF"/>
     <w:rPr>
-      <w:rFonts w:asciiTheme="majorHAnsi" w:hAnsiTheme="majorHAnsi" w:eastAsiaTheme="majorEastAsia" w:cstheme="majorBidi"/>
+      <w:rFonts w:asciiTheme="majorHAnsi" w:eastAsiaTheme="majorEastAsia" w:hAnsiTheme="majorHAnsi" w:cstheme="majorBidi"/>
       <w:color w:val="0F4761" w:themeColor="accent1" w:themeShade="BF"/>
       <w:sz w:val="32"/>
       <w:szCs w:val="32"/>
     </w:rPr>
   </w:style>
-  <w:style w:type="character" w:styleId="Heading3Char" w:customStyle="1">
-    <w:name w:val="Heading 3 Char"/>
-    <w:basedOn w:val="DefaultParagraphFont"/>
-    <w:link w:val="Heading3"/>
+  <w:style w:type="character" w:customStyle="1" w:styleId="Kop3Char">
+    <w:name w:val="Kop 3 Char"/>
+    <w:basedOn w:val="Standaardalinea-lettertype"/>
+    <w:link w:val="Kop3"/>
     <w:uiPriority w:val="9"/>
     <w:semiHidden/>
     <w:rsid w:val="003539DF"/>
@@ -3010,10 +3119,10 @@
       <w:szCs w:val="28"/>
     </w:rPr>
   </w:style>
-  <w:style w:type="character" w:styleId="Heading4Char" w:customStyle="1">
-    <w:name w:val="Heading 4 Char"/>
-    <w:basedOn w:val="DefaultParagraphFont"/>
-    <w:link w:val="Heading4"/>
+  <w:style w:type="character" w:customStyle="1" w:styleId="Kop4Char">
+    <w:name w:val="Kop 4 Char"/>
+    <w:basedOn w:val="Standaardalinea-lettertype"/>
+    <w:link w:val="Kop4"/>
     <w:uiPriority w:val="9"/>
     <w:semiHidden/>
     <w:rsid w:val="003539DF"/>
@@ -3024,10 +3133,10 @@
       <w:color w:val="0F4761" w:themeColor="accent1" w:themeShade="BF"/>
     </w:rPr>
   </w:style>
-  <w:style w:type="character" w:styleId="Heading5Char" w:customStyle="1">
-    <w:name w:val="Heading 5 Char"/>
-    <w:basedOn w:val="DefaultParagraphFont"/>
-    <w:link w:val="Heading5"/>
+  <w:style w:type="character" w:customStyle="1" w:styleId="Kop5Char">
+    <w:name w:val="Kop 5 Char"/>
+    <w:basedOn w:val="Standaardalinea-lettertype"/>
+    <w:link w:val="Kop5"/>
     <w:uiPriority w:val="9"/>
     <w:semiHidden/>
     <w:rsid w:val="003539DF"/>
@@ -3036,10 +3145,10 @@
       <w:color w:val="0F4761" w:themeColor="accent1" w:themeShade="BF"/>
     </w:rPr>
   </w:style>
-  <w:style w:type="character" w:styleId="Heading6Char" w:customStyle="1">
-    <w:name w:val="Heading 6 Char"/>
-    <w:basedOn w:val="DefaultParagraphFont"/>
-    <w:link w:val="Heading6"/>
+  <w:style w:type="character" w:customStyle="1" w:styleId="Kop6Char">
+    <w:name w:val="Kop 6 Char"/>
+    <w:basedOn w:val="Standaardalinea-lettertype"/>
+    <w:link w:val="Kop6"/>
     <w:uiPriority w:val="9"/>
     <w:semiHidden/>
     <w:rsid w:val="003539DF"/>
@@ -3050,10 +3159,10 @@
       <w:color w:val="595959" w:themeColor="text1" w:themeTint="A6"/>
     </w:rPr>
   </w:style>
-  <w:style w:type="character" w:styleId="Heading7Char" w:customStyle="1">
-    <w:name w:val="Heading 7 Char"/>
-    <w:basedOn w:val="DefaultParagraphFont"/>
-    <w:link w:val="Heading7"/>
+  <w:style w:type="character" w:customStyle="1" w:styleId="Kop7Char">
+    <w:name w:val="Kop 7 Char"/>
+    <w:basedOn w:val="Standaardalinea-lettertype"/>
+    <w:link w:val="Kop7"/>
     <w:uiPriority w:val="9"/>
     <w:semiHidden/>
     <w:rsid w:val="003539DF"/>
@@ -3062,10 +3171,10 @@
       <w:color w:val="595959" w:themeColor="text1" w:themeTint="A6"/>
     </w:rPr>
   </w:style>
-  <w:style w:type="character" w:styleId="Heading8Char" w:customStyle="1">
-    <w:name w:val="Heading 8 Char"/>
-    <w:basedOn w:val="DefaultParagraphFont"/>
-    <w:link w:val="Heading8"/>
+  <w:style w:type="character" w:customStyle="1" w:styleId="Kop8Char">
+    <w:name w:val="Kop 8 Char"/>
+    <w:basedOn w:val="Standaardalinea-lettertype"/>
+    <w:link w:val="Kop8"/>
     <w:uiPriority w:val="9"/>
     <w:semiHidden/>
     <w:rsid w:val="003539DF"/>
@@ -3076,10 +3185,10 @@
       <w:color w:val="272727" w:themeColor="text1" w:themeTint="D8"/>
     </w:rPr>
   </w:style>
-  <w:style w:type="character" w:styleId="Heading9Char" w:customStyle="1">
-    <w:name w:val="Heading 9 Char"/>
-    <w:basedOn w:val="DefaultParagraphFont"/>
-    <w:link w:val="Heading9"/>
+  <w:style w:type="character" w:customStyle="1" w:styleId="Kop9Char">
+    <w:name w:val="Kop 9 Char"/>
+    <w:basedOn w:val="Standaardalinea-lettertype"/>
+    <w:link w:val="Kop9"/>
     <w:uiPriority w:val="9"/>
     <w:semiHidden/>
     <w:rsid w:val="003539DF"/>
@@ -3088,11 +3197,11 @@
       <w:color w:val="272727" w:themeColor="text1" w:themeTint="D8"/>
     </w:rPr>
   </w:style>
-  <w:style w:type="paragraph" w:styleId="Title">
+  <w:style w:type="paragraph" w:styleId="Titel">
     <w:name w:val="Title"/>
-    <w:basedOn w:val="Normal"/>
-    <w:next w:val="Normal"/>
-    <w:link w:val="TitleChar"/>
+    <w:basedOn w:val="Standaard"/>
+    <w:next w:val="Standaard"/>
+    <w:link w:val="TitelChar"/>
     <w:uiPriority w:val="10"/>
     <w:qFormat/>
     <w:rsid w:val="003539DF"/>
@@ -3101,32 +3210,32 @@
       <w:contextualSpacing/>
     </w:pPr>
     <w:rPr>
-      <w:rFonts w:asciiTheme="majorHAnsi" w:hAnsiTheme="majorHAnsi" w:eastAsiaTheme="majorEastAsia" w:cstheme="majorBidi"/>
+      <w:rFonts w:asciiTheme="majorHAnsi" w:eastAsiaTheme="majorEastAsia" w:hAnsiTheme="majorHAnsi" w:cstheme="majorBidi"/>
       <w:spacing w:val="-10"/>
       <w:kern w:val="28"/>
       <w:sz w:val="56"/>
       <w:szCs w:val="56"/>
     </w:rPr>
   </w:style>
-  <w:style w:type="character" w:styleId="TitleChar" w:customStyle="1">
-    <w:name w:val="Title Char"/>
-    <w:basedOn w:val="DefaultParagraphFont"/>
-    <w:link w:val="Title"/>
+  <w:style w:type="character" w:customStyle="1" w:styleId="TitelChar">
+    <w:name w:val="Titel Char"/>
+    <w:basedOn w:val="Standaardalinea-lettertype"/>
+    <w:link w:val="Titel"/>
     <w:uiPriority w:val="10"/>
     <w:rsid w:val="003539DF"/>
     <w:rPr>
-      <w:rFonts w:asciiTheme="majorHAnsi" w:hAnsiTheme="majorHAnsi" w:eastAsiaTheme="majorEastAsia" w:cstheme="majorBidi"/>
+      <w:rFonts w:asciiTheme="majorHAnsi" w:eastAsiaTheme="majorEastAsia" w:hAnsiTheme="majorHAnsi" w:cstheme="majorBidi"/>
       <w:spacing w:val="-10"/>
       <w:kern w:val="28"/>
       <w:sz w:val="56"/>
       <w:szCs w:val="56"/>
     </w:rPr>
   </w:style>
-  <w:style w:type="paragraph" w:styleId="Subtitle">
+  <w:style w:type="paragraph" w:styleId="Ondertitel">
     <w:name w:val="Subtitle"/>
-    <w:basedOn w:val="Normal"/>
-    <w:next w:val="Normal"/>
-    <w:link w:val="SubtitleChar"/>
+    <w:basedOn w:val="Standaard"/>
+    <w:next w:val="Standaard"/>
+    <w:link w:val="OndertitelChar"/>
     <w:uiPriority w:val="11"/>
     <w:qFormat/>
     <w:rsid w:val="003539DF"/>
@@ -3143,10 +3252,10 @@
       <w:szCs w:val="28"/>
     </w:rPr>
   </w:style>
-  <w:style w:type="character" w:styleId="SubtitleChar" w:customStyle="1">
-    <w:name w:val="Subtitle Char"/>
-    <w:basedOn w:val="DefaultParagraphFont"/>
-    <w:link w:val="Subtitle"/>
+  <w:style w:type="character" w:customStyle="1" w:styleId="OndertitelChar">
+    <w:name w:val="Ondertitel Char"/>
+    <w:basedOn w:val="Standaardalinea-lettertype"/>
+    <w:link w:val="Ondertitel"/>
     <w:uiPriority w:val="11"/>
     <w:rsid w:val="003539DF"/>
     <w:rPr>
@@ -3157,11 +3266,11 @@
       <w:szCs w:val="28"/>
     </w:rPr>
   </w:style>
-  <w:style w:type="paragraph" w:styleId="Quote">
+  <w:style w:type="paragraph" w:styleId="Citaat">
     <w:name w:val="Quote"/>
-    <w:basedOn w:val="Normal"/>
-    <w:next w:val="Normal"/>
-    <w:link w:val="QuoteChar"/>
+    <w:basedOn w:val="Standaard"/>
+    <w:next w:val="Standaard"/>
+    <w:link w:val="CitaatChar"/>
     <w:uiPriority w:val="29"/>
     <w:qFormat/>
     <w:rsid w:val="003539DF"/>
@@ -3175,10 +3284,10 @@
       <w:color w:val="404040" w:themeColor="text1" w:themeTint="BF"/>
     </w:rPr>
   </w:style>
-  <w:style w:type="character" w:styleId="QuoteChar" w:customStyle="1">
-    <w:name w:val="Quote Char"/>
-    <w:basedOn w:val="DefaultParagraphFont"/>
-    <w:link w:val="Quote"/>
+  <w:style w:type="character" w:customStyle="1" w:styleId="CitaatChar">
+    <w:name w:val="Citaat Char"/>
+    <w:basedOn w:val="Standaardalinea-lettertype"/>
+    <w:link w:val="Citaat"/>
     <w:uiPriority w:val="29"/>
     <w:rsid w:val="003539DF"/>
     <w:rPr>
@@ -3187,10 +3296,10 @@
       <w:color w:val="404040" w:themeColor="text1" w:themeTint="BF"/>
     </w:rPr>
   </w:style>
-  <w:style w:type="paragraph" w:styleId="ListParagraph">
+  <w:style w:type="paragraph" w:styleId="Lijstalinea">
     <w:name w:val="List Paragraph"/>
-    <w:basedOn w:val="Normal"/>
-    <w:link w:val="ListParagraphChar"/>
+    <w:basedOn w:val="Standaard"/>
+    <w:link w:val="LijstalineaChar"/>
     <w:uiPriority w:val="34"/>
     <w:qFormat/>
     <w:rsid w:val="003539DF"/>
@@ -3199,9 +3308,9 @@
       <w:contextualSpacing/>
     </w:pPr>
   </w:style>
-  <w:style w:type="character" w:styleId="IntenseEmphasis">
+  <w:style w:type="character" w:styleId="Intensievebenadrukking">
     <w:name w:val="Intense Emphasis"/>
-    <w:basedOn w:val="DefaultParagraphFont"/>
+    <w:basedOn w:val="Standaardalinea-lettertype"/>
     <w:uiPriority w:val="21"/>
     <w:qFormat/>
     <w:rsid w:val="003539DF"/>
@@ -3211,18 +3320,18 @@
       <w:color w:val="0F4761" w:themeColor="accent1" w:themeShade="BF"/>
     </w:rPr>
   </w:style>
-  <w:style w:type="paragraph" w:styleId="IntenseQuote">
+  <w:style w:type="paragraph" w:styleId="Duidelijkcitaat">
     <w:name w:val="Intense Quote"/>
-    <w:basedOn w:val="Normal"/>
-    <w:next w:val="Normal"/>
-    <w:link w:val="IntenseQuoteChar"/>
+    <w:basedOn w:val="Standaard"/>
+    <w:next w:val="Standaard"/>
+    <w:link w:val="DuidelijkcitaatChar"/>
     <w:uiPriority w:val="30"/>
     <w:qFormat/>
     <w:rsid w:val="003539DF"/>
     <w:pPr>
       <w:pBdr>
-        <w:top w:val="single" w:color="0F4761" w:themeColor="accent1" w:themeShade="BF" w:sz="4" w:space="10"/>
-        <w:bottom w:val="single" w:color="0F4761" w:themeColor="accent1" w:themeShade="BF" w:sz="4" w:space="10"/>
+        <w:top w:val="single" w:sz="4" w:space="10" w:color="0F4761" w:themeColor="accent1" w:themeShade="BF"/>
+        <w:bottom w:val="single" w:sz="4" w:space="10" w:color="0F4761" w:themeColor="accent1" w:themeShade="BF"/>
       </w:pBdr>
       <w:spacing w:before="360" w:after="360"/>
       <w:ind w:left="864" w:right="864"/>
@@ -3234,10 +3343,10 @@
       <w:color w:val="0F4761" w:themeColor="accent1" w:themeShade="BF"/>
     </w:rPr>
   </w:style>
-  <w:style w:type="character" w:styleId="IntenseQuoteChar" w:customStyle="1">
-    <w:name w:val="Intense Quote Char"/>
-    <w:basedOn w:val="DefaultParagraphFont"/>
-    <w:link w:val="IntenseQuote"/>
+  <w:style w:type="character" w:customStyle="1" w:styleId="DuidelijkcitaatChar">
+    <w:name w:val="Duidelijk citaat Char"/>
+    <w:basedOn w:val="Standaardalinea-lettertype"/>
+    <w:link w:val="Duidelijkcitaat"/>
     <w:uiPriority w:val="30"/>
     <w:rsid w:val="003539DF"/>
     <w:rPr>
@@ -3246,9 +3355,9 @@
       <w:color w:val="0F4761" w:themeColor="accent1" w:themeShade="BF"/>
     </w:rPr>
   </w:style>
-  <w:style w:type="character" w:styleId="IntenseReference">
+  <w:style w:type="character" w:styleId="Intensieveverwijzing">
     <w:name w:val="Intense Reference"/>
-    <w:basedOn w:val="DefaultParagraphFont"/>
+    <w:basedOn w:val="Standaardalinea-lettertype"/>
     <w:uiPriority w:val="32"/>
     <w:qFormat/>
     <w:rsid w:val="003539DF"/>
@@ -3260,17 +3369,17 @@
       <w:spacing w:val="5"/>
     </w:rPr>
   </w:style>
-  <w:style w:type="character" w:styleId="ListParagraphChar" w:customStyle="1">
-    <w:name w:val="List Paragraph Char"/>
-    <w:basedOn w:val="DefaultParagraphFont"/>
-    <w:link w:val="ListParagraph"/>
+  <w:style w:type="character" w:customStyle="1" w:styleId="LijstalineaChar">
+    <w:name w:val="Lijstalinea Char"/>
+    <w:basedOn w:val="Standaardalinea-lettertype"/>
+    <w:link w:val="Lijstalinea"/>
     <w:uiPriority w:val="34"/>
     <w:qFormat/>
     <w:rsid w:val="00C22F06"/>
   </w:style>
-  <w:style w:type="table" w:styleId="TableGrid">
+  <w:style w:type="table" w:styleId="Tabelraster">
     <w:name w:val="Table Grid"/>
-    <w:basedOn w:val="TableNormal"/>
+    <w:basedOn w:val="Standaardtabel"/>
     <w:uiPriority w:val="39"/>
     <w:rsid w:val="00C22F06"/>
     <w:pPr>
@@ -3282,19 +3391,19 @@
     </w:rPr>
     <w:tblPr>
       <w:tblBorders>
-        <w:top w:val="single" w:color="auto" w:sz="4" w:space="0"/>
-        <w:left w:val="single" w:color="auto" w:sz="4" w:space="0"/>
-        <w:bottom w:val="single" w:color="auto" w:sz="4" w:space="0"/>
-        <w:right w:val="single" w:color="auto" w:sz="4" w:space="0"/>
-        <w:insideH w:val="single" w:color="auto" w:sz="4" w:space="0"/>
-        <w:insideV w:val="single" w:color="auto" w:sz="4" w:space="0"/>
+        <w:top w:val="single" w:sz="4" w:space="0" w:color="auto"/>
+        <w:left w:val="single" w:sz="4" w:space="0" w:color="auto"/>
+        <w:bottom w:val="single" w:sz="4" w:space="0" w:color="auto"/>
+        <w:right w:val="single" w:sz="4" w:space="0" w:color="auto"/>
+        <w:insideH w:val="single" w:sz="4" w:space="0" w:color="auto"/>
+        <w:insideV w:val="single" w:sz="4" w:space="0" w:color="auto"/>
       </w:tblBorders>
     </w:tblPr>
   </w:style>
-  <w:style w:type="paragraph" w:styleId="Header">
+  <w:style w:type="paragraph" w:styleId="Koptekst">
     <w:name w:val="header"/>
-    <w:basedOn w:val="Normal"/>
-    <w:link w:val="HeaderChar"/>
+    <w:basedOn w:val="Standaard"/>
+    <w:link w:val="KoptekstChar"/>
     <w:uiPriority w:val="99"/>
     <w:unhideWhenUsed/>
     <w:rsid w:val="00F65961"/>
@@ -3306,10 +3415,10 @@
       <w:spacing w:after="0" w:line="240" w:lineRule="auto"/>
     </w:pPr>
   </w:style>
-  <w:style w:type="character" w:styleId="HeaderChar" w:customStyle="1">
-    <w:name w:val="Header Char"/>
-    <w:basedOn w:val="DefaultParagraphFont"/>
-    <w:link w:val="Header"/>
+  <w:style w:type="character" w:customStyle="1" w:styleId="KoptekstChar">
+    <w:name w:val="Koptekst Char"/>
+    <w:basedOn w:val="Standaardalinea-lettertype"/>
+    <w:link w:val="Koptekst"/>
     <w:uiPriority w:val="99"/>
     <w:rsid w:val="00F65961"/>
     <w:rPr>
@@ -3318,10 +3427,10 @@
       <w:lang w:val="en-GB"/>
     </w:rPr>
   </w:style>
-  <w:style w:type="paragraph" w:styleId="Footer">
+  <w:style w:type="paragraph" w:styleId="Voettekst">
     <w:name w:val="footer"/>
-    <w:basedOn w:val="Normal"/>
-    <w:link w:val="FooterChar"/>
+    <w:basedOn w:val="Standaard"/>
+    <w:link w:val="VoettekstChar"/>
     <w:uiPriority w:val="99"/>
     <w:unhideWhenUsed/>
     <w:rsid w:val="00F65961"/>
@@ -3333,10 +3442,10 @@
       <w:spacing w:after="0" w:line="240" w:lineRule="auto"/>
     </w:pPr>
   </w:style>
-  <w:style w:type="character" w:styleId="FooterChar" w:customStyle="1">
-    <w:name w:val="Footer Char"/>
-    <w:basedOn w:val="DefaultParagraphFont"/>
-    <w:link w:val="Footer"/>
+  <w:style w:type="character" w:customStyle="1" w:styleId="VoettekstChar">
+    <w:name w:val="Voettekst Char"/>
+    <w:basedOn w:val="Standaardalinea-lettertype"/>
+    <w:link w:val="Voettekst"/>
     <w:uiPriority w:val="99"/>
     <w:rsid w:val="00F65961"/>
     <w:rPr>
@@ -3345,9 +3454,9 @@
       <w:lang w:val="en-GB"/>
     </w:rPr>
   </w:style>
-  <w:style w:type="character" w:styleId="CommentReference">
+  <w:style w:type="character" w:customStyle="1" w:styleId="CommentReference">
     <w:name w:val="Comment Reference"/>
-    <w:basedOn w:val="DefaultParagraphFont"/>
+    <w:basedOn w:val="Standaardalinea-lettertype"/>
     <w:uiPriority w:val="99"/>
     <w:semiHidden/>
     <w:unhideWhenUsed/>
@@ -3357,9 +3466,9 @@
       <w:szCs w:val="16"/>
     </w:rPr>
   </w:style>
-  <w:style w:type="paragraph" w:styleId="CommentText">
+  <w:style w:type="paragraph" w:customStyle="1" w:styleId="CommentText">
     <w:name w:val="Comment Text"/>
-    <w:basedOn w:val="Normal"/>
+    <w:basedOn w:val="Standaard"/>
     <w:link w:val="CommentTextChar"/>
     <w:uiPriority w:val="99"/>
     <w:unhideWhenUsed/>
@@ -3373,9 +3482,9 @@
       <w:lang w:val="en-GB"/>
     </w:rPr>
   </w:style>
-  <w:style w:type="character" w:styleId="CommentTextChar" w:customStyle="1">
+  <w:style w:type="character" w:customStyle="1" w:styleId="CommentTextChar">
     <w:name w:val="Comment Text Char"/>
-    <w:basedOn w:val="DefaultParagraphFont"/>
+    <w:basedOn w:val="Standaardalinea-lettertype"/>
     <w:link w:val="CommentText"/>
     <w:uiPriority w:val="99"/>
     <w:rsid w:val="002C3698"/>
@@ -3387,7 +3496,7 @@
   </w:style>
   <w:style w:type="character" w:styleId="Hyperlink">
     <w:name w:val="Hyperlink"/>
-    <w:basedOn w:val="DefaultParagraphFont"/>
+    <w:basedOn w:val="Standaardalinea-lettertype"/>
     <w:uiPriority w:val="99"/>
     <w:unhideWhenUsed/>
     <w:rsid w:val="007E4F29"/>
@@ -3396,9 +3505,9 @@
       <w:u w:val="single"/>
     </w:rPr>
   </w:style>
-  <w:style w:type="paragraph" w:styleId="CoverBold" w:customStyle="1">
+  <w:style w:type="paragraph" w:customStyle="1" w:styleId="CoverBold">
     <w:name w:val="CoverBold"/>
-    <w:basedOn w:val="Normal"/>
+    <w:basedOn w:val="Standaard"/>
     <w:link w:val="CoverBoldChar"/>
     <w:rsid w:val="007E4F29"/>
     <w:pPr>
@@ -3411,7 +3520,7 @@
       <w:jc w:val="both"/>
     </w:pPr>
     <w:rPr>
-      <w:rFonts w:ascii="Arial" w:hAnsi="Arial" w:eastAsia="Times New Roman" w:cs="Arial"/>
+      <w:rFonts w:eastAsia="Times New Roman"/>
       <w:b/>
       <w:kern w:val="0"/>
       <w:sz w:val="28"/>
@@ -3420,12 +3529,12 @@
       <w14:ligatures w14:val="none"/>
     </w:rPr>
   </w:style>
-  <w:style w:type="character" w:styleId="CoverBoldChar" w:customStyle="1">
+  <w:style w:type="character" w:customStyle="1" w:styleId="CoverBoldChar">
     <w:name w:val="CoverBold Char"/>
     <w:link w:val="CoverBold"/>
     <w:rsid w:val="007E4F29"/>
     <w:rPr>
-      <w:rFonts w:ascii="Arial" w:hAnsi="Arial" w:eastAsia="Times New Roman" w:cs="Arial"/>
+      <w:rFonts w:ascii="Arial" w:eastAsia="Times New Roman" w:hAnsi="Arial" w:cs="Arial"/>
       <w:b/>
       <w:kern w:val="0"/>
       <w:sz w:val="28"/>
@@ -3434,9 +3543,9 @@
       <w14:ligatures w14:val="none"/>
     </w:rPr>
   </w:style>
-  <w:style w:type="paragraph" w:styleId="TableParagraph" w:customStyle="1">
+  <w:style w:type="paragraph" w:customStyle="1" w:styleId="TableParagraph">
     <w:name w:val="Table Paragraph"/>
-    <w:basedOn w:val="Normal"/>
+    <w:basedOn w:val="Standaard"/>
     <w:uiPriority w:val="1"/>
     <w:qFormat/>
     <w:rsid w:val="007E4F29"/>
@@ -3445,15 +3554,15 @@
       <w:spacing w:after="0" w:line="240" w:lineRule="auto"/>
     </w:pPr>
     <w:rPr>
-      <w:rFonts w:ascii="Calibri" w:hAnsi="Calibri" w:eastAsia="Calibri" w:cs="Times New Roman"/>
+      <w:rFonts w:ascii="Calibri" w:eastAsia="Calibri" w:hAnsi="Calibri" w:cs="Times New Roman"/>
       <w:kern w:val="0"/>
       <w:lang w:val="en-US"/>
       <w14:ligatures w14:val="none"/>
     </w:rPr>
   </w:style>
-  <w:style w:type="table" w:styleId="Vragenlijst" w:customStyle="1">
+  <w:style w:type="table" w:customStyle="1" w:styleId="Vragenlijst">
     <w:name w:val="Vragenlijst"/>
-    <w:basedOn w:val="TableNormal"/>
+    <w:basedOn w:val="Standaardtabel"/>
     <w:uiPriority w:val="99"/>
     <w:rsid w:val="007E4F29"/>
     <w:pPr>
@@ -3488,9 +3597,9 @@
       </w:tcPr>
     </w:tblStylePr>
   </w:style>
-  <w:style w:type="table" w:styleId="Stijl1" w:customStyle="1">
+  <w:style w:type="table" w:customStyle="1" w:styleId="Stijl1">
     <w:name w:val="Stijl1"/>
-    <w:basedOn w:val="TableNormal"/>
+    <w:basedOn w:val="Standaardtabel"/>
     <w:uiPriority w:val="99"/>
     <w:rsid w:val="007E4F29"/>
     <w:pPr>
@@ -3516,16 +3625,16 @@
       </w:tcPr>
     </w:tblStylePr>
   </w:style>
-  <w:style w:type="paragraph" w:styleId="EndNoteBibliography" w:customStyle="1">
+  <w:style w:type="paragraph" w:customStyle="1" w:styleId="EndNoteBibliography">
     <w:name w:val="EndNote Bibliography"/>
-    <w:basedOn w:val="Normal"/>
+    <w:basedOn w:val="Standaard"/>
     <w:link w:val="EndNoteBibliographyChar"/>
     <w:rsid w:val="007E4F29"/>
     <w:pPr>
       <w:spacing w:after="0" w:line="240" w:lineRule="auto"/>
     </w:pPr>
     <w:rPr>
-      <w:rFonts w:ascii="Univers" w:hAnsi="Univers" w:eastAsia="Times New Roman" w:cs="Times New Roman"/>
+      <w:rFonts w:ascii="Univers" w:eastAsia="Times New Roman" w:hAnsi="Univers" w:cs="Times New Roman"/>
       <w:noProof/>
       <w:kern w:val="0"/>
       <w:sz w:val="20"/>
@@ -3534,13 +3643,13 @@
       <w14:ligatures w14:val="none"/>
     </w:rPr>
   </w:style>
-  <w:style w:type="character" w:styleId="EndNoteBibliographyChar" w:customStyle="1">
+  <w:style w:type="character" w:customStyle="1" w:styleId="EndNoteBibliographyChar">
     <w:name w:val="EndNote Bibliography Char"/>
-    <w:basedOn w:val="DefaultParagraphFont"/>
+    <w:basedOn w:val="Standaardalinea-lettertype"/>
     <w:link w:val="EndNoteBibliography"/>
     <w:rsid w:val="007E4F29"/>
     <w:rPr>
-      <w:rFonts w:ascii="Univers" w:hAnsi="Univers" w:eastAsia="Times New Roman" w:cs="Times New Roman"/>
+      <w:rFonts w:ascii="Univers" w:eastAsia="Times New Roman" w:hAnsi="Univers" w:cs="Times New Roman"/>
       <w:noProof/>
       <w:kern w:val="0"/>
       <w:sz w:val="20"/>
@@ -3553,7 +3662,7 @@
 </file>
 
 <file path=word/theme/theme1.xml><?xml version="1.0" encoding="utf-8"?>
-<a:theme xmlns:a="http://schemas.openxmlformats.org/drawingml/2006/main" xmlns:thm15="http://schemas.microsoft.com/office/thememl/2012/main" name="Office Theme">
+<a:theme xmlns:a="http://schemas.openxmlformats.org/drawingml/2006/main" name="Office Theme">
   <a:themeElements>
     <a:clrScheme name="Office">
       <a:dk1>
@@ -3868,6 +3977,21 @@
 </file>
 
 <file path=customXml/item1.xml><?xml version="1.0" encoding="utf-8"?>
+<p:properties xmlns:p="http://schemas.microsoft.com/office/2006/metadata/properties" xmlns:xsi="http://www.w3.org/2001/XMLSchema-instance" xmlns:pc="http://schemas.microsoft.com/office/infopath/2007/PartnerControls">
+  <documentManagement/>
+</p:properties>
+</file>
+
+<file path=customXml/item2.xml><?xml version="1.0" encoding="utf-8"?>
+<?mso-contentType ?>
+<FormTemplates xmlns="http://schemas.microsoft.com/sharepoint/v3/contenttype/forms">
+  <Display>DocumentLibraryForm</Display>
+  <Edit>DocumentLibraryForm</Edit>
+  <New>DocumentLibraryForm</New>
+</FormTemplates>
+</file>
+
+<file path=customXml/item3.xml><?xml version="1.0" encoding="utf-8"?>
 <ct:contentTypeSchema xmlns:ct="http://schemas.microsoft.com/office/2006/metadata/contentType" xmlns:ma="http://schemas.microsoft.com/office/2006/metadata/properties/metaAttributes" ct:_="" ma:_="" ma:contentTypeName="Document" ma:contentTypeID="0x010100F1B33D7B57FFEC4BB77B5001C5B93838" ma:contentTypeVersion="6" ma:contentTypeDescription="Een nieuw document maken." ma:contentTypeScope="" ma:versionID="59579db12405a868ad0e92c5e4f74ae1">
   <xsd:schema xmlns:xsd="http://www.w3.org/2001/XMLSchema" xmlns:xs="http://www.w3.org/2001/XMLSchema" xmlns:p="http://schemas.microsoft.com/office/2006/metadata/properties" xmlns:ns2="f44e6bd5-09db-4117-8b15-adf399208dc6" targetNamespace="http://schemas.microsoft.com/office/2006/metadata/properties" ma:root="true" ma:fieldsID="98cf673e6ff17a9b7a889e3f7df574b2" ns2:_="">
     <xsd:import namespace="f44e6bd5-09db-4117-8b15-adf399208dc6"/>
@@ -4023,29 +4147,37 @@
 </ct:contentTypeSchema>
 </file>
 
-<file path=customXml/item2.xml><?xml version="1.0" encoding="utf-8"?>
-<?mso-contentType ?>
-<FormTemplates xmlns="http://schemas.microsoft.com/sharepoint/v3/contenttype/forms">
-  <Display>DocumentLibraryForm</Display>
-  <Edit>DocumentLibraryForm</Edit>
-  <New>DocumentLibraryForm</New>
-</FormTemplates>
-</file>
-
-<file path=customXml/item3.xml><?xml version="1.0" encoding="utf-8"?>
-<p:properties xmlns:p="http://schemas.microsoft.com/office/2006/metadata/properties" xmlns:xsi="http://www.w3.org/2001/XMLSchema-instance" xmlns:pc="http://schemas.microsoft.com/office/infopath/2007/PartnerControls">
-  <documentManagement/>
-</p:properties>
-</file>
-
 <file path=customXml/itemProps1.xml><?xml version="1.0" encoding="utf-8"?>
-<ds:datastoreItem xmlns:ds="http://schemas.openxmlformats.org/officeDocument/2006/customXml" ds:itemID="{6BD938AE-6C45-4F9D-BCAE-AACF632435D7}"/>
+<ds:datastoreItem xmlns:ds="http://schemas.openxmlformats.org/officeDocument/2006/customXml" ds:itemID="{05FBA344-4A59-4256-854A-FD33827DBA63}">
+  <ds:schemaRefs>
+    <ds:schemaRef ds:uri="http://schemas.microsoft.com/office/2006/metadata/properties"/>
+    <ds:schemaRef ds:uri="http://schemas.microsoft.com/office/infopath/2007/PartnerControls"/>
+  </ds:schemaRefs>
+</ds:datastoreItem>
 </file>
 
 <file path=customXml/itemProps2.xml><?xml version="1.0" encoding="utf-8"?>
-<ds:datastoreItem xmlns:ds="http://schemas.openxmlformats.org/officeDocument/2006/customXml" ds:itemID="{AE0F948A-8E38-484A-AAFE-66A73BD22425}"/>
+<ds:datastoreItem xmlns:ds="http://schemas.openxmlformats.org/officeDocument/2006/customXml" ds:itemID="{AE0F948A-8E38-484A-AAFE-66A73BD22425}">
+  <ds:schemaRefs>
+    <ds:schemaRef ds:uri="http://schemas.microsoft.com/sharepoint/v3/contenttype/forms"/>
+  </ds:schemaRefs>
+</ds:datastoreItem>
 </file>
 
 <file path=customXml/itemProps3.xml><?xml version="1.0" encoding="utf-8"?>
-<ds:datastoreItem xmlns:ds="http://schemas.openxmlformats.org/officeDocument/2006/customXml" ds:itemID="{05FBA344-4A59-4256-854A-FD33827DBA63}"/>
+<ds:datastoreItem xmlns:ds="http://schemas.openxmlformats.org/officeDocument/2006/customXml" ds:itemID="{6BD938AE-6C45-4F9D-BCAE-AACF632435D7}">
+  <ds:schemaRefs>
+    <ds:schemaRef ds:uri="http://schemas.microsoft.com/office/2006/metadata/contentType"/>
+    <ds:schemaRef ds:uri="http://schemas.microsoft.com/office/2006/metadata/properties/metaAttributes"/>
+    <ds:schemaRef ds:uri="http://www.w3.org/2001/XMLSchema"/>
+    <ds:schemaRef ds:uri="http://schemas.microsoft.com/office/2006/metadata/properties"/>
+    <ds:schemaRef ds:uri="f44e6bd5-09db-4117-8b15-adf399208dc6"/>
+    <ds:schemaRef ds:uri="http://schemas.microsoft.com/office/2006/documentManagement/types"/>
+    <ds:schemaRef ds:uri="http://schemas.microsoft.com/office/infopath/2007/PartnerControls"/>
+    <ds:schemaRef ds:uri="http://schemas.openxmlformats.org/package/2006/metadata/core-properties"/>
+    <ds:schemaRef ds:uri="http://purl.org/dc/elements/1.1/"/>
+    <ds:schemaRef ds:uri="http://purl.org/dc/terms/"/>
+    <ds:schemaRef ds:uri="http://schemas.microsoft.com/internal/obd"/>
+  </ds:schemaRefs>
+</ds:datastoreItem>
 </file>
</xml_diff>